<commit_message>
docs(manual): añade a Cristhian Rodrigo Berrocal Salazar como autor
Autor en portada, sección de créditos y metadatos del documento (Author/Title)
de los 3 manuales (gestante, obstetra, admin), en PDF y DOCX.
</commit_message>
<xml_diff>
--- a/docs/manual/build/manual_usuario_admin_vitmaterna_movil.docx
+++ b/docs/manual/build/manual_usuario_admin_vitmaterna_movil.docx
@@ -86,7 +86,6 @@
     <w:p/>
     <w:p/>
     <w:p/>
-    <w:p/>
     <w:p>
       <w:pPr>
         <w:jc w:val="center"/>
@@ -124,6 +123,26 @@
       </w:r>
     </w:p>
     <w:p>
+      <w:pPr>
+        <w:jc w:val="center"/>
+      </w:pPr>
+      <w:r>
+        <w:rPr>
+          <w:color w:val="566873"/>
+          <w:sz w:val="22"/>
+        </w:rPr>
+        <w:t xml:space="preserve">Autor: </w:t>
+      </w:r>
+      <w:r>
+        <w:rPr>
+          <w:b/>
+          <w:color w:val="16242B"/>
+          <w:sz w:val="22"/>
+        </w:rPr>
+        <w:t>Cristhian Rodrigo Berrocal Salazar</w:t>
+      </w:r>
+    </w:p>
+    <w:p>
       <w:r>
         <w:br w:type="page"/>
       </w:r>
@@ -134,6 +153,17 @@
       </w:pPr>
       <w:r>
         <w:t>Créditos y confidencialidad</w:t>
+      </w:r>
+    </w:p>
+    <w:p>
+      <w:r>
+        <w:rPr>
+          <w:b/>
+        </w:rPr>
+        <w:t xml:space="preserve">Autor del manual: </w:t>
+      </w:r>
+      <w:r>
+        <w:t>Cristhian Rodrigo Berrocal Salazar</w:t>
       </w:r>
     </w:p>
     <w:p>

</xml_diff>

<commit_message>
docs(manual): autor en mayúsculas — CRISTHIAN RODRIGO BERROCAL SALAZAR
</commit_message>
<xml_diff>
--- a/docs/manual/build/manual_usuario_admin_vitmaterna_movil.docx
+++ b/docs/manual/build/manual_usuario_admin_vitmaterna_movil.docx
@@ -139,7 +139,7 @@
           <w:color w:val="16242B"/>
           <w:sz w:val="22"/>
         </w:rPr>
-        <w:t>Cristhian Rodrigo Berrocal Salazar</w:t>
+        <w:t>CRISTHIAN RODRIGO BERROCAL SALAZAR</w:t>
       </w:r>
     </w:p>
     <w:p>
@@ -163,7 +163,7 @@
         <w:t xml:space="preserve">Autor del manual: </w:t>
       </w:r>
       <w:r>
-        <w:t>Cristhian Rodrigo Berrocal Salazar</w:t>
+        <w:t>CRISTHIAN RODRIGO BERROCAL SALAZAR</w:t>
       </w:r>
     </w:p>
     <w:p>

</xml_diff>

<commit_message>
docs(manual): formato profesional + se elimina "propiedad del Centro de Salud"
- quita la frase de propiedad en créditos (gestante, obstetra, admin)
- maquetación más legible: cuerpo justificado, interlineado 1.4, espaciado entre
  párrafos, títulos con línea de acento y respiración, pasos numerados y cuadros
  de nota con padding y separación
- validación QA intacta (31/31 pantallas, 51/51 marcas)
</commit_message>
<xml_diff>
--- a/docs/manual/build/manual_usuario_admin_vitmaterna_movil.docx
+++ b/docs/manual/build/manual_usuario_admin_vitmaterna_movil.docx
@@ -150,12 +150,18 @@
     <w:p>
       <w:pPr>
         <w:pStyle w:val="Heading1"/>
+        <w:pBdr>
+          <w:bottom w:val="single" w:sz="8" w:space="4" w:color="3C5168"/>
+        </w:pBdr>
       </w:pPr>
       <w:r>
         <w:t>Créditos y confidencialidad</w:t>
       </w:r>
     </w:p>
     <w:p>
+      <w:pPr>
+        <w:jc w:val="both"/>
+      </w:pPr>
       <w:r>
         <w:rPr>
           <w:b/>
@@ -167,11 +173,17 @@
       </w:r>
     </w:p>
     <w:p>
+      <w:pPr>
+        <w:jc w:val="both"/>
+      </w:pPr>
       <w:r>
-        <w:t>Este documento es el manual de usuario oficial de la aplicación móvil VITMATERNA, propiedad del Centro de Salud Talavera. Se entrega con fines de capacitación y uso del sistema.</w:t>
+        <w:t>Este documento es el manual de usuario oficial de la aplicación móvil VITMATERNA, plataforma de seguimiento de salud prenatal. Se entrega con fines de capacitación y uso del sistema.</w:t>
       </w:r>
     </w:p>
     <w:p>
+      <w:pPr>
+        <w:jc w:val="both"/>
+      </w:pPr>
       <w:r>
         <w:t>La información que aparece en las capturas corresponde a datos de demostración y no representa a personas reales. El manejo de datos de salud se realiza conforme a la normativa de protección de datos personales vigente.</w:t>
       </w:r>
@@ -180,6 +192,7 @@
       <w:tblPr>
         <w:tblW w:type="auto" w:w="0"/>
         <w:jc w:val="center"/>
+        <w:tblLayout w:type="fixed"/>
         <w:tblLook w:firstColumn="1" w:firstRow="1" w:lastColumn="0" w:lastRow="0" w:noHBand="0" w:noVBand="1" w:val="04A0"/>
       </w:tblPr>
       <w:tblGrid>
@@ -188,17 +201,26 @@
       <w:tr>
         <w:tc>
           <w:tcPr>
-            <w:tcW w:type="dxa" w:w="9746"/>
+            <w:tcW w:type="dxa" w:w="9411"/>
             <w:shd w:val="clear" w:fill="EEF2F3"/>
+            <w:tcMar>
+              <w:top w:w="80" w:type="dxa"/>
+              <w:bottom w:w="80" w:type="dxa"/>
+              <w:start w:w="120" w:type="dxa"/>
+              <w:end w:w="120" w:type="dxa"/>
+            </w:tcMar>
           </w:tcPr>
           <w:p>
+            <w:pPr>
+              <w:spacing w:after="0" w:line="312" w:lineRule="auto"/>
+            </w:pPr>
             <w:r>
               <w:rPr>
                 <w:b/>
                 <w:color w:val="3C5168"/>
                 <w:sz w:val="20"/>
               </w:rPr>
-              <w:t xml:space="preserve">Nota: </w:t>
+              <w:t xml:space="preserve">Nota.  </w:t>
             </w:r>
             <w:r>
               <w:rPr>
@@ -212,6 +234,11 @@
       </w:tr>
     </w:tbl>
     <w:p>
+      <w:pPr>
+        <w:spacing w:after="80"/>
+      </w:pPr>
+    </w:p>
+    <w:p>
       <w:r>
         <w:br w:type="page"/>
       </w:r>
@@ -219,6 +246,9 @@
     <w:p>
       <w:pPr>
         <w:pStyle w:val="Heading1"/>
+        <w:pBdr>
+          <w:bottom w:val="single" w:sz="8" w:space="4" w:color="3C5168"/>
+        </w:pBdr>
       </w:pPr>
       <w:r>
         <w:t>Índice de contenidos</w:t>
@@ -809,7 +839,7 @@
                 <w:color w:val="16242B"/>
                 <w:sz w:val="20"/>
               </w:rPr>
-              <w:t>14</w:t>
+              <w:t>15</w:t>
             </w:r>
           </w:p>
         </w:tc>
@@ -823,6 +853,9 @@
     <w:p>
       <w:pPr>
         <w:pStyle w:val="Heading1"/>
+        <w:pBdr>
+          <w:bottom w:val="single" w:sz="8" w:space="4" w:color="3C5168"/>
+        </w:pBdr>
       </w:pPr>
       <w:r>
         <w:t>1. Introducción</w:t>
@@ -837,6 +870,9 @@
       </w:r>
     </w:p>
     <w:p>
+      <w:pPr>
+        <w:jc w:val="both"/>
+      </w:pPr>
       <w:r>
         <w:t>VITMATERNA es la plataforma cuyo panel de administración te permite controlar todo el sistema: aprobar y gestionar usuarios, publicar contenido educativo, configurar los canales de notificación (SMS y WhatsApp), ajustar parámetros del sistema, administrar las sedes y revisar la auditoría.</w:t>
       </w:r>
@@ -850,6 +886,9 @@
       </w:r>
     </w:p>
     <w:p>
+      <w:pPr>
+        <w:jc w:val="both"/>
+      </w:pPr>
       <w:r>
         <w:t>Al personal administrador que gestiona el sistema VITMATERNA.</w:t>
       </w:r>
@@ -863,6 +902,9 @@
       </w:r>
     </w:p>
     <w:p>
+      <w:pPr>
+        <w:jc w:val="both"/>
+      </w:pPr>
       <w:r>
         <w:t>Explica, paso a paso y con imágenes, cada función del panel: inicio, usuarios, contenido, canales de notificación, configuración, sedes y auditoría.</w:t>
       </w:r>
@@ -870,6 +912,9 @@
     <w:p>
       <w:pPr>
         <w:pStyle w:val="Heading1"/>
+        <w:pBdr>
+          <w:bottom w:val="single" w:sz="8" w:space="4" w:color="3C5168"/>
+        </w:pBdr>
       </w:pPr>
       <w:r>
         <w:t>2. Antes de empezar</w:t>
@@ -884,6 +929,9 @@
       </w:r>
     </w:p>
     <w:p>
+      <w:pPr>
+        <w:jc w:val="both"/>
+      </w:pPr>
       <w:r>
         <w:t>• Un teléfono con Android o iPhone (iOS).</w:t>
         <w:br/>
@@ -901,6 +949,9 @@
       </w:r>
     </w:p>
     <w:p>
+      <w:pPr>
+        <w:jc w:val="both"/>
+      </w:pPr>
       <w:r>
         <w:t>En las imágenes verás marcas numeradas y recuadros que indican exactamente de qué elemento se habla y en qué orden usarlo:</w:t>
       </w:r>
@@ -999,6 +1050,9 @@
     <w:p>
       <w:pPr>
         <w:pStyle w:val="Heading1"/>
+        <w:pBdr>
+          <w:bottom w:val="single" w:sz="8" w:space="4" w:color="3C5168"/>
+        </w:pBdr>
       </w:pPr>
       <w:r>
         <w:t>3. Acceso al sistema</w:t>
@@ -1007,6 +1061,7 @@
     <w:p>
       <w:pPr>
         <w:pStyle w:val="ListNumber"/>
+        <w:spacing w:after="120" w:line="312" w:lineRule="auto"/>
       </w:pPr>
       <w:r>
         <w:t>Abre la aplicación VITMATERNA en tu teléfono.</w:t>
@@ -1015,6 +1070,7 @@
     <w:p>
       <w:pPr>
         <w:pStyle w:val="ListNumber"/>
+        <w:spacing w:after="120" w:line="312" w:lineRule="auto"/>
       </w:pPr>
       <w:r>
         <w:t>Escribe tu número de DNI.</w:t>
@@ -1023,6 +1079,7 @@
     <w:p>
       <w:pPr>
         <w:pStyle w:val="ListNumber"/>
+        <w:spacing w:after="120" w:line="312" w:lineRule="auto"/>
       </w:pPr>
       <w:r>
         <w:t>Escribe tu contraseña.</w:t>
@@ -1031,6 +1088,7 @@
     <w:p>
       <w:pPr>
         <w:pStyle w:val="ListNumber"/>
+        <w:spacing w:after="120" w:line="312" w:lineRule="auto"/>
       </w:pPr>
       <w:r>
         <w:t>Toca el botón «Iniciar Sesión».</w:t>
@@ -1040,6 +1098,7 @@
       <w:tblPr>
         <w:tblW w:type="auto" w:w="0"/>
         <w:jc w:val="center"/>
+        <w:tblLayout w:type="fixed"/>
         <w:tblLook w:firstColumn="1" w:firstRow="1" w:lastColumn="0" w:lastRow="0" w:noHBand="0" w:noVBand="1" w:val="04A0"/>
       </w:tblPr>
       <w:tblGrid>
@@ -1048,17 +1107,26 @@
       <w:tr>
         <w:tc>
           <w:tcPr>
-            <w:tcW w:type="dxa" w:w="9746"/>
+            <w:tcW w:type="dxa" w:w="9411"/>
             <w:shd w:val="clear" w:fill="EEF2F3"/>
+            <w:tcMar>
+              <w:top w:w="80" w:type="dxa"/>
+              <w:bottom w:w="80" w:type="dxa"/>
+              <w:start w:w="120" w:type="dxa"/>
+              <w:end w:w="120" w:type="dxa"/>
+            </w:tcMar>
           </w:tcPr>
           <w:p>
+            <w:pPr>
+              <w:spacing w:after="0" w:line="312" w:lineRule="auto"/>
+            </w:pPr>
             <w:r>
               <w:rPr>
                 <w:b/>
                 <w:color w:val="3C5168"/>
                 <w:sz w:val="20"/>
               </w:rPr>
-              <w:t xml:space="preserve">Nota: </w:t>
+              <w:t xml:space="preserve">Nota.  </w:t>
             </w:r>
             <w:r>
               <w:rPr>
@@ -1071,6 +1139,11 @@
         </w:tc>
       </w:tr>
     </w:tbl>
+    <w:p>
+      <w:pPr>
+        <w:spacing w:after="80"/>
+      </w:pPr>
+    </w:p>
     <w:p>
       <w:r>
         <w:br w:type="page"/>
@@ -1085,6 +1158,9 @@
       </w:r>
     </w:p>
     <w:p>
+      <w:pPr>
+        <w:jc w:val="both"/>
+      </w:pPr>
       <w:r>
         <w:t>Es la primera pantalla al entrar. Resume el estado del sistema.</w:t>
       </w:r>
@@ -1092,6 +1168,7 @@
     <w:p>
       <w:pPr>
         <w:pStyle w:val="ListNumber"/>
+        <w:spacing w:after="120" w:line="312" w:lineRule="auto"/>
       </w:pPr>
       <w:r>
         <w:t>① «Cuentas por aprobar»: si hay obstetras o gestantes esperando aprobación, aparecen aquí para resolverlo.</w:t>
@@ -1100,6 +1177,7 @@
     <w:p>
       <w:pPr>
         <w:pStyle w:val="ListNumber"/>
+        <w:spacing w:after="120" w:line="312" w:lineRule="auto"/>
       </w:pPr>
       <w:r>
         <w:t>② «Resumen»: las cifras clave (usuarios, gestantes activas, alto riesgo y citas del día).</w:t>
@@ -1146,6 +1224,7 @@
     </w:p>
     <w:p>
       <w:pPr>
+        <w:spacing w:before="40" w:after="240"/>
         <w:jc w:val="center"/>
       </w:pPr>
       <w:r>
@@ -1166,6 +1245,9 @@
       </w:r>
     </w:p>
     <w:p>
+      <w:pPr>
+        <w:jc w:val="both"/>
+      </w:pPr>
       <w:r>
         <w:t>Más abajo en el inicio encuentras:</w:t>
       </w:r>
@@ -1173,6 +1255,7 @@
     <w:p>
       <w:pPr>
         <w:pStyle w:val="ListNumber"/>
+        <w:spacing w:after="120" w:line="312" w:lineRule="auto"/>
       </w:pPr>
       <w:r>
         <w:t>① «Estado del sistema»: alertas, contenido publicado y si los canales SMS/WhatsApp están activos.</w:t>
@@ -1181,6 +1264,7 @@
     <w:p>
       <w:pPr>
         <w:pStyle w:val="ListNumber"/>
+        <w:spacing w:after="120" w:line="312" w:lineRule="auto"/>
       </w:pPr>
       <w:r>
         <w:t>② «Gestión»: accesos rápidos a Usuarios, Contenido y Reportes.</w:t>
@@ -1227,6 +1311,7 @@
     </w:p>
     <w:p>
       <w:pPr>
+        <w:spacing w:before="40" w:after="240"/>
         <w:jc w:val="center"/>
       </w:pPr>
       <w:r>
@@ -1247,6 +1332,9 @@
       </w:r>
     </w:p>
     <w:p>
+      <w:pPr>
+        <w:jc w:val="both"/>
+      </w:pPr>
       <w:r>
         <w:t>Administra todas las cuentas del sistema.</w:t>
       </w:r>
@@ -1254,6 +1342,7 @@
     <w:p>
       <w:pPr>
         <w:pStyle w:val="ListNumber"/>
+        <w:spacing w:after="120" w:line="312" w:lineRule="auto"/>
       </w:pPr>
       <w:r>
         <w:t>① Buscador por nombre o DNI. En cada usuario puedes ver su ficha, aprobar la cuenta, activarla o desactivarla, editar sus datos, cambiar la contraseña o eliminarlo. Para crear una cuenta nueva usa el botón «+» (o «Nuevo usuario» en el portal web) y elige el rol.</w:t>
@@ -1300,6 +1389,7 @@
     </w:p>
     <w:p>
       <w:pPr>
+        <w:spacing w:before="40" w:after="240"/>
         <w:jc w:val="center"/>
       </w:pPr>
       <w:r>
@@ -1315,6 +1405,7 @@
       <w:tblPr>
         <w:tblW w:type="auto" w:w="0"/>
         <w:jc w:val="center"/>
+        <w:tblLayout w:type="fixed"/>
         <w:tblLook w:firstColumn="1" w:firstRow="1" w:lastColumn="0" w:lastRow="0" w:noHBand="0" w:noVBand="1" w:val="04A0"/>
       </w:tblPr>
       <w:tblGrid>
@@ -1323,17 +1414,26 @@
       <w:tr>
         <w:tc>
           <w:tcPr>
-            <w:tcW w:type="dxa" w:w="9746"/>
+            <w:tcW w:type="dxa" w:w="9411"/>
             <w:shd w:val="clear" w:fill="EEF2F3"/>
+            <w:tcMar>
+              <w:top w:w="80" w:type="dxa"/>
+              <w:bottom w:w="80" w:type="dxa"/>
+              <w:start w:w="120" w:type="dxa"/>
+              <w:end w:w="120" w:type="dxa"/>
+            </w:tcMar>
           </w:tcPr>
           <w:p>
+            <w:pPr>
+              <w:spacing w:after="0" w:line="312" w:lineRule="auto"/>
+            </w:pPr>
             <w:r>
               <w:rPr>
                 <w:b/>
                 <w:color w:val="3C5168"/>
                 <w:sz w:val="20"/>
               </w:rPr>
-              <w:t xml:space="preserve">Nota: </w:t>
+              <w:t xml:space="preserve">Nota.  </w:t>
             </w:r>
             <w:r>
               <w:rPr>
@@ -1348,6 +1448,11 @@
     </w:tbl>
     <w:p>
       <w:pPr>
+        <w:spacing w:after="80"/>
+      </w:pPr>
+    </w:p>
+    <w:p>
+      <w:pPr>
         <w:pStyle w:val="Heading2"/>
       </w:pPr>
       <w:r>
@@ -1355,6 +1460,9 @@
       </w:r>
     </w:p>
     <w:p>
+      <w:pPr>
+        <w:jc w:val="both"/>
+      </w:pPr>
       <w:r>
         <w:t>Crea y administra los recursos que verán las gestantes.</w:t>
       </w:r>
@@ -1362,6 +1470,7 @@
     <w:p>
       <w:pPr>
         <w:pStyle w:val="ListNumber"/>
+        <w:spacing w:after="120" w:line="312" w:lineRule="auto"/>
       </w:pPr>
       <w:r>
         <w:t>① Busca y filtra por categoría. Usa el botón de crear para publicar un nuevo artículo, infografía, video o audio (con su categoría y trimestre). En cada elemento puedes editar o eliminar, y ver las estadísticas de lectura.</w:t>
@@ -1408,6 +1517,7 @@
     </w:p>
     <w:p>
       <w:pPr>
+        <w:spacing w:before="40" w:after="240"/>
         <w:jc w:val="center"/>
       </w:pPr>
       <w:r>
@@ -1428,6 +1538,9 @@
       </w:r>
     </w:p>
     <w:p>
+      <w:pPr>
+        <w:jc w:val="both"/>
+      </w:pPr>
       <w:r>
         <w:t>Configura los canales para enviar mensajes reales a las gestantes.</w:t>
       </w:r>
@@ -1435,6 +1548,7 @@
     <w:p>
       <w:pPr>
         <w:pStyle w:val="ListNumber"/>
+        <w:spacing w:after="120" w:line="312" w:lineRule="auto"/>
       </w:pPr>
       <w:r>
         <w:t>① «SMS (Twilio)»: activa el canal y guarda las credenciales; puedes enviar un mensaje de prueba. Más abajo, «WhatsApp (Cloud API)» se configura de forma similar.</w:t>
@@ -1481,6 +1595,7 @@
     </w:p>
     <w:p>
       <w:pPr>
+        <w:spacing w:before="40" w:after="240"/>
         <w:jc w:val="center"/>
       </w:pPr>
       <w:r>
@@ -1496,6 +1611,7 @@
       <w:tblPr>
         <w:tblW w:type="auto" w:w="0"/>
         <w:jc w:val="center"/>
+        <w:tblLayout w:type="fixed"/>
         <w:tblLook w:firstColumn="1" w:firstRow="1" w:lastColumn="0" w:lastRow="0" w:noHBand="0" w:noVBand="1" w:val="04A0"/>
       </w:tblPr>
       <w:tblGrid>
@@ -1504,17 +1620,26 @@
       <w:tr>
         <w:tc>
           <w:tcPr>
-            <w:tcW w:type="dxa" w:w="9746"/>
+            <w:tcW w:type="dxa" w:w="9411"/>
             <w:shd w:val="clear" w:fill="EEF2F3"/>
+            <w:tcMar>
+              <w:top w:w="80" w:type="dxa"/>
+              <w:bottom w:w="80" w:type="dxa"/>
+              <w:start w:w="120" w:type="dxa"/>
+              <w:end w:w="120" w:type="dxa"/>
+            </w:tcMar>
           </w:tcPr>
           <w:p>
+            <w:pPr>
+              <w:spacing w:after="0" w:line="312" w:lineRule="auto"/>
+            </w:pPr>
             <w:r>
               <w:rPr>
                 <w:b/>
                 <w:color w:val="3C5168"/>
                 <w:sz w:val="20"/>
               </w:rPr>
-              <w:t xml:space="preserve">Nota: </w:t>
+              <w:t xml:space="preserve">Nota.  </w:t>
             </w:r>
             <w:r>
               <w:rPr>
@@ -1529,6 +1654,11 @@
     </w:tbl>
     <w:p>
       <w:pPr>
+        <w:spacing w:after="80"/>
+      </w:pPr>
+    </w:p>
+    <w:p>
+      <w:pPr>
         <w:pStyle w:val="Heading2"/>
       </w:pPr>
       <w:r>
@@ -1536,6 +1666,9 @@
       </w:r>
     </w:p>
     <w:p>
+      <w:pPr>
+        <w:jc w:val="both"/>
+      </w:pPr>
       <w:r>
         <w:t>Ajusta los parámetros generales.</w:t>
       </w:r>
@@ -1543,6 +1676,7 @@
     <w:p>
       <w:pPr>
         <w:pStyle w:val="ListNumber"/>
+        <w:spacing w:after="120" w:line="312" w:lineRule="auto"/>
       </w:pPr>
       <w:r>
         <w:t>① «Límites y Accesos»: máximo de pacientes por obstetra y si se permiten nuevos registros. Más abajo: parámetros clínicos (altitud para corregir la hemoglobina), generación automática de cronogramas y el modo mantenimiento.</w:t>
@@ -1589,6 +1723,7 @@
     </w:p>
     <w:p>
       <w:pPr>
+        <w:spacing w:before="40" w:after="240"/>
         <w:jc w:val="center"/>
       </w:pPr>
       <w:r>
@@ -1604,6 +1739,7 @@
       <w:tblPr>
         <w:tblW w:type="auto" w:w="0"/>
         <w:jc w:val="center"/>
+        <w:tblLayout w:type="fixed"/>
         <w:tblLook w:firstColumn="1" w:firstRow="1" w:lastColumn="0" w:lastRow="0" w:noHBand="0" w:noVBand="1" w:val="04A0"/>
       </w:tblPr>
       <w:tblGrid>
@@ -1612,17 +1748,26 @@
       <w:tr>
         <w:tc>
           <w:tcPr>
-            <w:tcW w:type="dxa" w:w="9746"/>
+            <w:tcW w:type="dxa" w:w="9411"/>
             <w:shd w:val="clear" w:fill="EEF2F3"/>
+            <w:tcMar>
+              <w:top w:w="80" w:type="dxa"/>
+              <w:bottom w:w="80" w:type="dxa"/>
+              <w:start w:w="120" w:type="dxa"/>
+              <w:end w:w="120" w:type="dxa"/>
+            </w:tcMar>
           </w:tcPr>
           <w:p>
+            <w:pPr>
+              <w:spacing w:after="0" w:line="312" w:lineRule="auto"/>
+            </w:pPr>
             <w:r>
               <w:rPr>
                 <w:b/>
                 <w:color w:val="3C5168"/>
                 <w:sz w:val="20"/>
               </w:rPr>
-              <w:t xml:space="preserve">Nota: </w:t>
+              <w:t xml:space="preserve">Nota.  </w:t>
             </w:r>
             <w:r>
               <w:rPr>
@@ -1637,6 +1782,11 @@
     </w:tbl>
     <w:p>
       <w:pPr>
+        <w:spacing w:after="80"/>
+      </w:pPr>
+    </w:p>
+    <w:p>
+      <w:pPr>
         <w:pStyle w:val="Heading2"/>
       </w:pPr>
       <w:r>
@@ -1644,6 +1794,9 @@
       </w:r>
     </w:p>
     <w:p>
+      <w:pPr>
+        <w:jc w:val="both"/>
+      </w:pPr>
       <w:r>
         <w:t>Administra las sedes del centro de salud.</w:t>
       </w:r>
@@ -1651,6 +1804,7 @@
     <w:p>
       <w:pPr>
         <w:pStyle w:val="ListNumber"/>
+        <w:spacing w:after="120" w:line="312" w:lineRule="auto"/>
       </w:pPr>
       <w:r>
         <w:t>① Toca el botón «Crear establecimiento» para registrar una sede nueva (nombre, código, dirección, teléfono, altitud y servicios). En cada sede puedes editar o eliminar.</w:t>
@@ -1697,6 +1851,7 @@
     </w:p>
     <w:p>
       <w:pPr>
+        <w:spacing w:before="40" w:after="240"/>
         <w:jc w:val="center"/>
       </w:pPr>
       <w:r>
@@ -1717,6 +1872,9 @@
       </w:r>
     </w:p>
     <w:p>
+      <w:pPr>
+        <w:jc w:val="both"/>
+      </w:pPr>
       <w:r>
         <w:t>Revisa la actividad del sistema y respalda la base de datos.</w:t>
       </w:r>
@@ -1724,6 +1882,7 @@
     <w:p>
       <w:pPr>
         <w:pStyle w:val="ListNumber"/>
+        <w:spacing w:after="120" w:line="312" w:lineRule="auto"/>
       </w:pPr>
       <w:r>
         <w:t>① «Exportar Backup BD»: descarga un respaldo completo de la base de datos. Más abajo se muestra el registro de auditoría (quién hizo qué y cuándo).</w:t>
@@ -1770,6 +1929,7 @@
     </w:p>
     <w:p>
       <w:pPr>
+        <w:spacing w:before="40" w:after="240"/>
         <w:jc w:val="center"/>
       </w:pPr>
       <w:r>
@@ -1789,6 +1949,9 @@
     <w:p>
       <w:pPr>
         <w:pStyle w:val="Heading1"/>
+        <w:pBdr>
+          <w:bottom w:val="single" w:sz="8" w:space="4" w:color="3C5168"/>
+        </w:pBdr>
       </w:pPr>
       <w:r>
         <w:t>Solución de problemas</w:t>
@@ -1803,6 +1966,9 @@
       </w:r>
     </w:p>
     <w:p>
+      <w:pPr>
+        <w:jc w:val="both"/>
+      </w:pPr>
       <w:r>
         <w:t>Significa que no hay registros pendientes. Las nuevas solicitudes de obstetra aparecerán automáticamente en el inicio.</w:t>
       </w:r>
@@ -1816,6 +1982,9 @@
       </w:r>
     </w:p>
     <w:p>
+      <w:pPr>
+        <w:jc w:val="both"/>
+      </w:pPr>
       <w:r>
         <w:t>Verifica que guardaste las credenciales correctas de Twilio (SMS) o WhatsApp Cloud API y usa el botón de prueba.</w:t>
       </w:r>
@@ -1829,6 +1998,9 @@
       </w:r>
     </w:p>
     <w:p>
+      <w:pPr>
+        <w:jc w:val="both"/>
+      </w:pPr>
       <w:r>
         <w:t>Confirma el cuadro de diálogo de advertencia. Recuerda que bloqueará a gestantes y obstetras.</w:t>
       </w:r>
@@ -1836,6 +2008,9 @@
     <w:p>
       <w:pPr>
         <w:pStyle w:val="Heading1"/>
+        <w:pBdr>
+          <w:bottom w:val="single" w:sz="8" w:space="4" w:color="3C5168"/>
+        </w:pBdr>
       </w:pPr>
       <w:r>
         <w:t>Preguntas frecuentes</w:t>
@@ -1850,6 +2025,9 @@
       </w:r>
     </w:p>
     <w:p>
+      <w:pPr>
+        <w:jc w:val="both"/>
+      </w:pPr>
       <w:r>
         <w:t>Desde el inicio o desde «Usuarios», abre la cuenta pendiente y toca «Aprobar».</w:t>
       </w:r>
@@ -1863,6 +2041,9 @@
       </w:r>
     </w:p>
     <w:p>
+      <w:pPr>
+        <w:jc w:val="both"/>
+      </w:pPr>
       <w:r>
         <w:t>En «Contenido», usa el botón de crear, completa los datos y guárdalo.</w:t>
       </w:r>
@@ -1876,6 +2057,9 @@
       </w:r>
     </w:p>
     <w:p>
+      <w:pPr>
+        <w:jc w:val="both"/>
+      </w:pPr>
       <w:r>
         <w:t>En «Auditoría y backup», usa «Exportar Backup BD».</w:t>
       </w:r>
@@ -1883,6 +2067,9 @@
     <w:p>
       <w:pPr>
         <w:pStyle w:val="Heading1"/>
+        <w:pBdr>
+          <w:bottom w:val="single" w:sz="8" w:space="4" w:color="3C5168"/>
+        </w:pBdr>
       </w:pPr>
       <w:r>
         <w:t>Glosario</w:t>
@@ -1946,12 +2133,18 @@
     <w:p>
       <w:pPr>
         <w:pStyle w:val="Heading1"/>
+        <w:pBdr>
+          <w:bottom w:val="single" w:sz="8" w:space="4" w:color="3C5168"/>
+        </w:pBdr>
       </w:pPr>
       <w:r>
         <w:t>Soporte y contacto</w:t>
       </w:r>
     </w:p>
     <w:p>
+      <w:pPr>
+        <w:jc w:val="both"/>
+      </w:pPr>
       <w:r>
         <w:t>Para soporte de la aplicación, comunícate con el área de sistemas de tu establecimiento. Para emergencias clínicas, acude al establecimiento de salud.</w:t>
       </w:r>
@@ -2392,6 +2585,9 @@
     <w:name w:val="Normal"/>
     <w:qFormat/>
     <w:rsid w:val="00FC693F"/>
+    <w:pPr>
+      <w:spacing w:line="336" w:lineRule="auto" w:after="160" w:before="0"/>
+    </w:pPr>
     <w:rPr>
       <w:rFonts w:ascii="Calibri" w:hAnsi="Calibri"/>
       <w:color w:val="16242B"/>
@@ -2453,15 +2649,16 @@
     <w:pPr>
       <w:keepNext/>
       <w:keepLines/>
-      <w:spacing w:before="480" w:after="0"/>
+      <w:spacing w:before="360" w:after="160" w:line="276" w:lineRule="auto"/>
       <w:outlineLvl w:val="0"/>
     </w:pPr>
     <w:rPr>
       <w:rFonts w:asciiTheme="majorHAnsi" w:eastAsiaTheme="majorEastAsia" w:hAnsiTheme="majorHAnsi" w:cstheme="majorBidi" w:ascii="Calibri" w:hAnsi="Calibri"/>
       <w:b/>
       <w:bCs/>
+      <w:i w:val="0"/>
       <w:color w:val="3C5168"/>
-      <w:sz w:val="34"/>
+      <w:sz w:val="32"/>
       <w:szCs w:val="28"/>
     </w:rPr>
   </w:style>
@@ -2477,13 +2674,14 @@
     <w:pPr>
       <w:keepNext/>
       <w:keepLines/>
-      <w:spacing w:before="200" w:after="0"/>
+      <w:spacing w:before="280" w:after="80" w:line="276" w:lineRule="auto"/>
       <w:outlineLvl w:val="1"/>
     </w:pPr>
     <w:rPr>
       <w:rFonts w:asciiTheme="majorHAnsi" w:eastAsiaTheme="majorEastAsia" w:hAnsiTheme="majorHAnsi" w:cstheme="majorBidi" w:ascii="Calibri" w:hAnsi="Calibri"/>
       <w:b/>
       <w:bCs/>
+      <w:i w:val="0"/>
       <w:color w:val="16242B"/>
       <w:sz w:val="26"/>
       <w:szCs w:val="26"/>
@@ -2501,15 +2699,16 @@
     <w:pPr>
       <w:keepNext/>
       <w:keepLines/>
-      <w:spacing w:before="200" w:after="0"/>
+      <w:spacing w:before="200" w:after="40" w:line="276" w:lineRule="auto"/>
       <w:outlineLvl w:val="2"/>
     </w:pPr>
     <w:rPr>
       <w:rFonts w:asciiTheme="majorHAnsi" w:eastAsiaTheme="majorEastAsia" w:hAnsiTheme="majorHAnsi" w:cstheme="majorBidi" w:ascii="Calibri" w:hAnsi="Calibri"/>
       <w:b/>
       <w:bCs/>
+      <w:i w:val="0"/>
       <w:color w:val="3C5168"/>
-      <w:sz w:val="22"/>
+      <w:sz w:val="23"/>
     </w:rPr>
   </w:style>
   <w:style w:type="paragraph" w:styleId="Heading4">
@@ -2964,8 +3163,12 @@
       <w:numPr>
         <w:numId w:val="5"/>
       </w:numPr>
+      <w:spacing w:after="120" w:line="312" w:lineRule="auto"/>
       <w:contextualSpacing/>
     </w:pPr>
+    <w:rPr>
+      <w:sz w:val="22"/>
+    </w:rPr>
   </w:style>
   <w:style w:type="paragraph" w:styleId="ListNumber2">
     <w:name w:val="List Number 2"/>

</xml_diff>

<commit_message>
docs(manual): login + paginación + redacción profesional
- añade la captura de la pantalla de inicio de sesión (sección 3) en los 3 roles
- corrige la numeración de páginas del pie ("Página X de Y") usando campos PAGE/
  NUMPAGES completos que LibreOffice calcula al exportar
- reescribe la introducción con redacción formal (¿Qué es?, Propósito, Contenido),
  eliminando frases coloquiales/sin sentido para un manual de usuario
- requisitos como lista con viñetas
- validación QA intacta (31/31 pantallas, 51/51 marcas)
</commit_message>
<xml_diff>
--- a/docs/manual/build/manual_usuario_admin_vitmaterna_movil.docx
+++ b/docs/manual/build/manual_usuario_admin_vitmaterna_movil.docx
@@ -431,7 +431,7 @@
                 <w:color w:val="16242B"/>
                 <w:sz w:val="20"/>
               </w:rPr>
-              <w:t>5</w:t>
+              <w:t>6</w:t>
             </w:r>
           </w:p>
         </w:tc>
@@ -465,7 +465,7 @@
                 <w:color w:val="16242B"/>
                 <w:sz w:val="20"/>
               </w:rPr>
-              <w:t>6</w:t>
+              <w:t>7</w:t>
             </w:r>
           </w:p>
         </w:tc>
@@ -499,7 +499,7 @@
                 <w:color w:val="16242B"/>
                 <w:sz w:val="20"/>
               </w:rPr>
-              <w:t>6</w:t>
+              <w:t>7</w:t>
             </w:r>
           </w:p>
         </w:tc>
@@ -533,7 +533,7 @@
                 <w:color w:val="16242B"/>
                 <w:sz w:val="20"/>
               </w:rPr>
-              <w:t>7</w:t>
+              <w:t>8</w:t>
             </w:r>
           </w:p>
         </w:tc>
@@ -567,7 +567,7 @@
                 <w:color w:val="16242B"/>
                 <w:sz w:val="20"/>
               </w:rPr>
-              <w:t>8</w:t>
+              <w:t>9</w:t>
             </w:r>
           </w:p>
         </w:tc>
@@ -601,7 +601,7 @@
                 <w:color w:val="16242B"/>
                 <w:sz w:val="20"/>
               </w:rPr>
-              <w:t>9</w:t>
+              <w:t>10</w:t>
             </w:r>
           </w:p>
         </w:tc>
@@ -635,7 +635,7 @@
                 <w:color w:val="16242B"/>
                 <w:sz w:val="20"/>
               </w:rPr>
-              <w:t>10</w:t>
+              <w:t>11</w:t>
             </w:r>
           </w:p>
         </w:tc>
@@ -669,7 +669,7 @@
                 <w:color w:val="16242B"/>
                 <w:sz w:val="20"/>
               </w:rPr>
-              <w:t>11</w:t>
+              <w:t>12</w:t>
             </w:r>
           </w:p>
         </w:tc>
@@ -703,7 +703,7 @@
                 <w:color w:val="16242B"/>
                 <w:sz w:val="20"/>
               </w:rPr>
-              <w:t>12</w:t>
+              <w:t>13</w:t>
             </w:r>
           </w:p>
         </w:tc>
@@ -737,7 +737,7 @@
                 <w:color w:val="16242B"/>
                 <w:sz w:val="20"/>
               </w:rPr>
-              <w:t>14</w:t>
+              <w:t>15</w:t>
             </w:r>
           </w:p>
         </w:tc>
@@ -771,7 +771,7 @@
                 <w:color w:val="16242B"/>
                 <w:sz w:val="20"/>
               </w:rPr>
-              <w:t>14</w:t>
+              <w:t>15</w:t>
             </w:r>
           </w:p>
         </w:tc>
@@ -805,7 +805,7 @@
                 <w:color w:val="16242B"/>
                 <w:sz w:val="20"/>
               </w:rPr>
-              <w:t>14</w:t>
+              <w:t>15</w:t>
             </w:r>
           </w:p>
         </w:tc>
@@ -839,7 +839,7 @@
                 <w:color w:val="16242B"/>
                 <w:sz w:val="20"/>
               </w:rPr>
-              <w:t>15</w:t>
+              <w:t>16</w:t>
             </w:r>
           </w:p>
         </w:tc>
@@ -882,7 +882,7 @@
         <w:pStyle w:val="Heading2"/>
       </w:pPr>
       <w:r>
-        <w:t>1.2 ¿A quién está dirigido?</w:t>
+        <w:t>1.2 Propósito de este manual</w:t>
       </w:r>
     </w:p>
     <w:p>
@@ -890,7 +890,7 @@
         <w:jc w:val="both"/>
       </w:pPr>
       <w:r>
-        <w:t>Al personal administrador que gestiona el sistema VITMATERNA.</w:t>
+        <w:t>Este manual está dirigido al personal administrador del sistema y tiene como objetivo guiar la configuración y gestión de la plataforma, mediante instrucciones paso a paso acompañadas de capturas de pantalla.</w:t>
       </w:r>
     </w:p>
     <w:p>
@@ -898,7 +898,7 @@
         <w:pStyle w:val="Heading2"/>
       </w:pPr>
       <w:r>
-        <w:t>1.3 Alcance</w:t>
+        <w:t>1.3 Contenido</w:t>
       </w:r>
     </w:p>
     <w:p>
@@ -906,7 +906,7 @@
         <w:jc w:val="both"/>
       </w:pPr>
       <w:r>
-        <w:t>Explica, paso a paso y con imágenes, cada función del panel: inicio, usuarios, contenido, canales de notificación, configuración, sedes y auditoría.</w:t>
+        <w:t>El documento abarca el panel de control, la gestión de usuarios, el contenido educativo, los canales de notificación, la configuración del sistema, la administración de sedes y la auditoría.</w:t>
       </w:r>
     </w:p>
     <w:p>
@@ -933,11 +933,34 @@
         <w:jc w:val="both"/>
       </w:pPr>
       <w:r>
-        <w:t>• Un teléfono con Android o iPhone (iOS).</w:t>
-        <w:br/>
-        <w:t>• Conexión a internet (datos móviles o wifi).</w:t>
-        <w:br/>
-        <w:t>• Tu número de DNI y la contraseña de tu cuenta.</w:t>
+        <w:t>Para utilizar la aplicación es necesario contar con:</w:t>
+      </w:r>
+    </w:p>
+    <w:p>
+      <w:pPr>
+        <w:pStyle w:val="ListBullet"/>
+        <w:spacing w:after="80" w:line="312" w:lineRule="auto"/>
+      </w:pPr>
+      <w:r>
+        <w:t>Un teléfono móvil con sistema operativo Android o iOS (iPhone).</w:t>
+      </w:r>
+    </w:p>
+    <w:p>
+      <w:pPr>
+        <w:pStyle w:val="ListBullet"/>
+        <w:spacing w:after="80" w:line="312" w:lineRule="auto"/>
+      </w:pPr>
+      <w:r>
+        <w:t>Conexión a internet (datos móviles o red wifi).</w:t>
+      </w:r>
+    </w:p>
+    <w:p>
+      <w:pPr>
+        <w:pStyle w:val="ListBullet"/>
+        <w:spacing w:after="80" w:line="312" w:lineRule="auto"/>
+      </w:pPr>
+      <w:r>
+        <w:t>Las credenciales de acceso: número de DNI y contraseña.</w:t>
       </w:r>
     </w:p>
     <w:p>
@@ -1060,11 +1083,10 @@
     </w:p>
     <w:p>
       <w:pPr>
-        <w:pStyle w:val="ListNumber"/>
-        <w:spacing w:after="120" w:line="312" w:lineRule="auto"/>
+        <w:jc w:val="both"/>
       </w:pPr>
       <w:r>
-        <w:t>Abre la aplicación VITMATERNA en tu teléfono.</w:t>
+        <w:t>Al abrir la aplicación se muestra la pantalla de inicio de sesión. Ingresa tus credenciales para acceder a tu cuenta:</w:t>
       </w:r>
     </w:p>
     <w:p>
@@ -1073,7 +1095,7 @@
         <w:spacing w:after="120" w:line="312" w:lineRule="auto"/>
       </w:pPr>
       <w:r>
-        <w:t>Escribe tu número de DNI.</w:t>
+        <w:t>En el campo «DNI», escribe tu número de documento.</w:t>
       </w:r>
     </w:p>
     <w:p>
@@ -1082,7 +1104,7 @@
         <w:spacing w:after="120" w:line="312" w:lineRule="auto"/>
       </w:pPr>
       <w:r>
-        <w:t>Escribe tu contraseña.</w:t>
+        <w:t>En el campo «Contraseña», escribe tu contraseña.</w:t>
       </w:r>
     </w:p>
     <w:p>
@@ -1091,7 +1113,60 @@
         <w:spacing w:after="120" w:line="312" w:lineRule="auto"/>
       </w:pPr>
       <w:r>
-        <w:t>Toca el botón «Iniciar Sesión».</w:t>
+        <w:t>Toca el botón «Iniciar Sesión» para ingresar.</w:t>
+      </w:r>
+    </w:p>
+    <w:p>
+      <w:pPr>
+        <w:jc w:val="center"/>
+      </w:pPr>
+      <w:r>
+        <w:drawing>
+          <wp:inline xmlns:a="http://schemas.openxmlformats.org/drawingml/2006/main" xmlns:pic="http://schemas.openxmlformats.org/drawingml/2006/picture">
+            <wp:extent cx="1936058" cy="4068000"/>
+            <wp:docPr id="2" name="Picture 2"/>
+            <wp:cNvGraphicFramePr>
+              <a:graphicFrameLocks noChangeAspect="1"/>
+            </wp:cNvGraphicFramePr>
+            <a:graphic>
+              <a:graphicData uri="http://schemas.openxmlformats.org/drawingml/2006/picture">
+                <pic:pic>
+                  <pic:nvPicPr>
+                    <pic:cNvPr id="0" name="A0.png"/>
+                    <pic:cNvPicPr/>
+                  </pic:nvPicPr>
+                  <pic:blipFill>
+                    <a:blip r:embed="rId12"/>
+                    <a:stretch>
+                      <a:fillRect/>
+                    </a:stretch>
+                  </pic:blipFill>
+                  <pic:spPr>
+                    <a:xfrm>
+                      <a:off x="0" y="0"/>
+                      <a:ext cx="1936058" cy="4068000"/>
+                    </a:xfrm>
+                    <a:prstGeom prst="rect"/>
+                  </pic:spPr>
+                </pic:pic>
+              </a:graphicData>
+            </a:graphic>
+          </wp:inline>
+        </w:drawing>
+      </w:r>
+    </w:p>
+    <w:p>
+      <w:pPr>
+        <w:spacing w:before="40" w:after="240"/>
+        <w:jc w:val="center"/>
+      </w:pPr>
+      <w:r>
+        <w:rPr>
+          <w:i/>
+          <w:color w:val="566873"/>
+          <w:sz w:val="18"/>
+        </w:rPr>
+        <w:t>Figura C-1. Pantalla de inicio de sesión.</w:t>
       </w:r>
     </w:p>
     <w:tbl>
@@ -1133,7 +1208,7 @@
                 <w:color w:val="16242B"/>
                 <w:sz w:val="20"/>
               </w:rPr>
-              <w:t>La primera vez verás un recorrido guiado «Conoce tu app». Puedes verlo otra vez desde tu perfil.</w:t>
+              <w:t>Durante el primer ingreso se mostrará el recorrido guiado «Conoce tu app», que puede repetirse en cualquier momento desde el perfil.</w:t>
             </w:r>
           </w:p>
         </w:tc>
@@ -1191,7 +1266,7 @@
         <w:drawing>
           <wp:inline xmlns:a="http://schemas.openxmlformats.org/drawingml/2006/main" xmlns:pic="http://schemas.openxmlformats.org/drawingml/2006/picture">
             <wp:extent cx="1936058" cy="4068000"/>
-            <wp:docPr id="2" name="Picture 2"/>
+            <wp:docPr id="3" name="Picture 3"/>
             <wp:cNvGraphicFramePr>
               <a:graphicFrameLocks noChangeAspect="1"/>
             </wp:cNvGraphicFramePr>
@@ -1203,7 +1278,7 @@
                     <pic:cNvPicPr/>
                   </pic:nvPicPr>
                   <pic:blipFill>
-                    <a:blip r:embed="rId12"/>
+                    <a:blip r:embed="rId13"/>
                     <a:stretch>
                       <a:fillRect/>
                     </a:stretch>
@@ -1233,7 +1308,7 @@
           <w:color w:val="566873"/>
           <w:sz w:val="18"/>
         </w:rPr>
-        <w:t>Figura C-1. Panel de control del administrador.</w:t>
+        <w:t>Figura C-2. Panel de control del administrador.</w:t>
       </w:r>
     </w:p>
     <w:p>
@@ -1278,7 +1353,7 @@
         <w:drawing>
           <wp:inline xmlns:a="http://schemas.openxmlformats.org/drawingml/2006/main" xmlns:pic="http://schemas.openxmlformats.org/drawingml/2006/picture">
             <wp:extent cx="1936058" cy="4068000"/>
-            <wp:docPr id="3" name="Picture 3"/>
+            <wp:docPr id="4" name="Picture 4"/>
             <wp:cNvGraphicFramePr>
               <a:graphicFrameLocks noChangeAspect="1"/>
             </wp:cNvGraphicFramePr>
@@ -1290,7 +1365,7 @@
                     <pic:cNvPicPr/>
                   </pic:nvPicPr>
                   <pic:blipFill>
-                    <a:blip r:embed="rId13"/>
+                    <a:blip r:embed="rId14"/>
                     <a:stretch>
                       <a:fillRect/>
                     </a:stretch>
@@ -1320,7 +1395,7 @@
           <w:color w:val="566873"/>
           <w:sz w:val="18"/>
         </w:rPr>
-        <w:t>Figura C-2. Estado del sistema y accesos de gestión.</w:t>
+        <w:t>Figura C-3. Estado del sistema y accesos de gestión.</w:t>
       </w:r>
     </w:p>
     <w:p>
@@ -1356,7 +1431,7 @@
         <w:drawing>
           <wp:inline xmlns:a="http://schemas.openxmlformats.org/drawingml/2006/main" xmlns:pic="http://schemas.openxmlformats.org/drawingml/2006/picture">
             <wp:extent cx="1936058" cy="4068000"/>
-            <wp:docPr id="4" name="Picture 4"/>
+            <wp:docPr id="5" name="Picture 5"/>
             <wp:cNvGraphicFramePr>
               <a:graphicFrameLocks noChangeAspect="1"/>
             </wp:cNvGraphicFramePr>
@@ -1368,7 +1443,7 @@
                     <pic:cNvPicPr/>
                   </pic:nvPicPr>
                   <pic:blipFill>
-                    <a:blip r:embed="rId14"/>
+                    <a:blip r:embed="rId15"/>
                     <a:stretch>
                       <a:fillRect/>
                     </a:stretch>
@@ -1398,7 +1473,7 @@
           <w:color w:val="566873"/>
           <w:sz w:val="18"/>
         </w:rPr>
-        <w:t>Figura C-3. Gestión de usuarios.</w:t>
+        <w:t>Figura C-4. Gestión de usuarios.</w:t>
       </w:r>
     </w:p>
     <w:tbl>
@@ -1484,7 +1559,7 @@
         <w:drawing>
           <wp:inline xmlns:a="http://schemas.openxmlformats.org/drawingml/2006/main" xmlns:pic="http://schemas.openxmlformats.org/drawingml/2006/picture">
             <wp:extent cx="1936058" cy="4068000"/>
-            <wp:docPr id="5" name="Picture 5"/>
+            <wp:docPr id="6" name="Picture 6"/>
             <wp:cNvGraphicFramePr>
               <a:graphicFrameLocks noChangeAspect="1"/>
             </wp:cNvGraphicFramePr>
@@ -1496,7 +1571,7 @@
                     <pic:cNvPicPr/>
                   </pic:nvPicPr>
                   <pic:blipFill>
-                    <a:blip r:embed="rId15"/>
+                    <a:blip r:embed="rId16"/>
                     <a:stretch>
                       <a:fillRect/>
                     </a:stretch>
@@ -1526,7 +1601,7 @@
           <w:color w:val="566873"/>
           <w:sz w:val="18"/>
         </w:rPr>
-        <w:t>Figura C-4. Gestión de contenido educativo.</w:t>
+        <w:t>Figura C-5. Gestión de contenido educativo.</w:t>
       </w:r>
     </w:p>
     <w:p>
@@ -1562,7 +1637,7 @@
         <w:drawing>
           <wp:inline xmlns:a="http://schemas.openxmlformats.org/drawingml/2006/main" xmlns:pic="http://schemas.openxmlformats.org/drawingml/2006/picture">
             <wp:extent cx="1936058" cy="4068000"/>
-            <wp:docPr id="6" name="Picture 6"/>
+            <wp:docPr id="7" name="Picture 7"/>
             <wp:cNvGraphicFramePr>
               <a:graphicFrameLocks noChangeAspect="1"/>
             </wp:cNvGraphicFramePr>
@@ -1574,7 +1649,7 @@
                     <pic:cNvPicPr/>
                   </pic:nvPicPr>
                   <pic:blipFill>
-                    <a:blip r:embed="rId16"/>
+                    <a:blip r:embed="rId17"/>
                     <a:stretch>
                       <a:fillRect/>
                     </a:stretch>
@@ -1604,7 +1679,7 @@
           <w:color w:val="566873"/>
           <w:sz w:val="18"/>
         </w:rPr>
-        <w:t>Figura C-5. Canales de notificación SMS y WhatsApp.</w:t>
+        <w:t>Figura C-6. Canales de notificación SMS y WhatsApp.</w:t>
       </w:r>
     </w:p>
     <w:tbl>
@@ -1690,7 +1765,7 @@
         <w:drawing>
           <wp:inline xmlns:a="http://schemas.openxmlformats.org/drawingml/2006/main" xmlns:pic="http://schemas.openxmlformats.org/drawingml/2006/picture">
             <wp:extent cx="1936058" cy="4068000"/>
-            <wp:docPr id="7" name="Picture 7"/>
+            <wp:docPr id="8" name="Picture 8"/>
             <wp:cNvGraphicFramePr>
               <a:graphicFrameLocks noChangeAspect="1"/>
             </wp:cNvGraphicFramePr>
@@ -1702,7 +1777,7 @@
                     <pic:cNvPicPr/>
                   </pic:nvPicPr>
                   <pic:blipFill>
-                    <a:blip r:embed="rId17"/>
+                    <a:blip r:embed="rId18"/>
                     <a:stretch>
                       <a:fillRect/>
                     </a:stretch>
@@ -1732,7 +1807,7 @@
           <w:color w:val="566873"/>
           <w:sz w:val="18"/>
         </w:rPr>
-        <w:t>Figura C-6. Configuración del sistema.</w:t>
+        <w:t>Figura C-7. Configuración del sistema.</w:t>
       </w:r>
     </w:p>
     <w:tbl>
@@ -1818,7 +1893,7 @@
         <w:drawing>
           <wp:inline xmlns:a="http://schemas.openxmlformats.org/drawingml/2006/main" xmlns:pic="http://schemas.openxmlformats.org/drawingml/2006/picture">
             <wp:extent cx="1936058" cy="4068000"/>
-            <wp:docPr id="8" name="Picture 8"/>
+            <wp:docPr id="9" name="Picture 9"/>
             <wp:cNvGraphicFramePr>
               <a:graphicFrameLocks noChangeAspect="1"/>
             </wp:cNvGraphicFramePr>
@@ -1830,7 +1905,7 @@
                     <pic:cNvPicPr/>
                   </pic:nvPicPr>
                   <pic:blipFill>
-                    <a:blip r:embed="rId18"/>
+                    <a:blip r:embed="rId19"/>
                     <a:stretch>
                       <a:fillRect/>
                     </a:stretch>
@@ -1860,7 +1935,7 @@
           <w:color w:val="566873"/>
           <w:sz w:val="18"/>
         </w:rPr>
-        <w:t>Figura C-7. Establecimientos de salud.</w:t>
+        <w:t>Figura C-8. Establecimientos de salud.</w:t>
       </w:r>
     </w:p>
     <w:p>
@@ -1896,7 +1971,7 @@
         <w:drawing>
           <wp:inline xmlns:a="http://schemas.openxmlformats.org/drawingml/2006/main" xmlns:pic="http://schemas.openxmlformats.org/drawingml/2006/picture">
             <wp:extent cx="1936058" cy="4068000"/>
-            <wp:docPr id="9" name="Picture 9"/>
+            <wp:docPr id="10" name="Picture 10"/>
             <wp:cNvGraphicFramePr>
               <a:graphicFrameLocks noChangeAspect="1"/>
             </wp:cNvGraphicFramePr>
@@ -1908,7 +1983,7 @@
                     <pic:cNvPicPr/>
                   </pic:nvPicPr>
                   <pic:blipFill>
-                    <a:blip r:embed="rId19"/>
+                    <a:blip r:embed="rId20"/>
                     <a:stretch>
                       <a:fillRect/>
                     </a:stretch>
@@ -1938,7 +2013,7 @@
           <w:color w:val="566873"/>
           <w:sz w:val="18"/>
         </w:rPr>
-        <w:t>Figura C-8. Auditoría y backup del sistema.</w:t>
+        <w:t>Figura C-9. Auditoría y backup del sistema.</w:t>
       </w:r>
     </w:p>
     <w:p>
@@ -2187,10 +2262,34 @@
         <w:color w:val="566873"/>
         <w:sz w:val="16"/>
       </w:rPr>
-      <w:t xml:space="preserve">VITMATERNA · Guía para el Administrador · Página </w:t>
+      <w:t xml:space="preserve">VITMATERNA · Guía para el Administrador     ·     Página </w:t>
     </w:r>
     <w:r>
-      <w:fldSimple w:instr="PAGE"/>
+      <w:rPr>
+        <w:color w:val="566873"/>
+        <w:sz w:val="16"/>
+      </w:rPr>
+      <w:fldChar w:fldCharType="begin"/>
+      <w:instrText xml:space="preserve">PAGE</w:instrText>
+      <w:fldChar w:fldCharType="separate"/>
+      <w:fldChar w:fldCharType="end"/>
+    </w:r>
+    <w:r>
+      <w:rPr>
+        <w:color w:val="566873"/>
+        <w:sz w:val="16"/>
+      </w:rPr>
+      <w:t xml:space="preserve"> de </w:t>
+    </w:r>
+    <w:r>
+      <w:rPr>
+        <w:color w:val="566873"/>
+        <w:sz w:val="16"/>
+      </w:rPr>
+      <w:fldChar w:fldCharType="begin"/>
+      <w:instrText xml:space="preserve">NUMPAGES</w:instrText>
+      <w:fldChar w:fldCharType="separate"/>
+      <w:fldChar w:fldCharType="end"/>
     </w:r>
   </w:p>
 </w:ftr>

</xml_diff>

<commit_message>
docs(manual): fuente legible, comillas correctas, índice clickeable y sin huecos
- corrige los "símbolos" raros: la fuente Calibri no existía y el PDF usaba una
  fuente china de respaldo; ahora usa Carlito (libre, métrica-compatible) con
  cobertura completa de acentos y comillas
- comillas tipográficas “ ” en todo el documento (legibles en cualquier visor)
- índice de contenidos clickeable: bookmarks en cada título + hipervínculos
  internos en las entradas del TOC (64 enlaces)
- elimina los espacios en blanco: se quitan los saltos de página forzados entre
  secciones; el contenido fluye y la imagen se mantiene junto a su epígrafe
- formaliza la nota de consulta del índice
</commit_message>
<xml_diff>
--- a/docs/manual/build/manual_usuario_admin_vitmaterna_movil.docx
+++ b/docs/manual/build/manual_usuario_admin_vitmaterna_movil.docx
@@ -148,6 +148,7 @@
       </w:r>
     </w:p>
     <w:p>
+      <w:bookmarkStart w:id="1000" w:name="bm_Cr_ditos_y_confidencialidad"/>
       <w:pPr>
         <w:pStyle w:val="Heading1"/>
         <w:pBdr>
@@ -157,6 +158,7 @@
       <w:r>
         <w:t>Créditos y confidencialidad</w:t>
       </w:r>
+      <w:bookmarkEnd w:id="1000"/>
     </w:p>
     <w:p>
       <w:pPr>
@@ -227,7 +229,7 @@
                 <w:color w:val="16242B"/>
                 <w:sz w:val="20"/>
               </w:rPr>
-              <w:t>Este manual es una guía de consulta. Usa el índice para ir directo a la tarea que necesites.</w:t>
+              <w:t>Este documento está diseñado como guía de consulta; se recomienda utilizar el índice para acceder directamente a la sección deseada.</w:t>
             </w:r>
           </w:p>
         </w:tc>
@@ -244,6 +246,7 @@
       </w:r>
     </w:p>
     <w:p>
+      <w:bookmarkStart w:id="1001" w:name="bm__ndice_de_contenidos"/>
       <w:pPr>
         <w:pStyle w:val="Heading1"/>
         <w:pBdr>
@@ -253,6 +256,7 @@
       <w:r>
         <w:t>Índice de contenidos</w:t>
       </w:r>
+      <w:bookmarkEnd w:id="1001"/>
     </w:p>
     <w:p>
       <w:r/>
@@ -272,14 +276,20 @@
             <w:tcW w:type="dxa" w:w="4873"/>
           </w:tcPr>
           <w:p>
-            <w:r>
-              <w:rPr>
-                <w:b/>
-                <w:color w:val="0C8174"/>
-                <w:sz w:val="22"/>
-              </w:rPr>
-              <w:t>Créditos y confidencialidad</w:t>
-            </w:r>
+            <w:pPr>
+              <w:spacing w:after="60" w:line="288" w:lineRule="auto"/>
+            </w:pPr>
+            <w:hyperlink w:anchor="bm_Cr_ditos_y_confidencialidad">
+              <w:r>
+                <w:rPr>
+                  <w:rFonts w:ascii="Carlito" w:hAnsi="Carlito"/>
+                  <w:sz w:val="22"/>
+                  <w:b/>
+                  <w:color w:val="3C5168"/>
+                </w:rPr>
+                <w:t xml:space="preserve">Créditos y confidencialidad</w:t>
+              </w:r>
+            </w:hyperlink>
           </w:p>
         </w:tc>
         <w:tc>
@@ -290,13 +300,16 @@
             <w:pPr>
               <w:jc w:val="right"/>
             </w:pPr>
-            <w:r>
-              <w:rPr>
-                <w:color w:val="16242B"/>
-                <w:sz w:val="20"/>
-              </w:rPr>
-              <w:t>2</w:t>
-            </w:r>
+            <w:hyperlink w:anchor="bm_Cr_ditos_y_confidencialidad">
+              <w:r>
+                <w:rPr>
+                  <w:rFonts w:ascii="Carlito" w:hAnsi="Carlito"/>
+                  <w:sz w:val="20"/>
+                  <w:color w:val="16242B"/>
+                </w:rPr>
+                <w:t xml:space="preserve">2</w:t>
+              </w:r>
+            </w:hyperlink>
           </w:p>
         </w:tc>
       </w:tr>
@@ -306,14 +319,20 @@
             <w:tcW w:type="dxa" w:w="4873"/>
           </w:tcPr>
           <w:p>
-            <w:r>
-              <w:rPr>
-                <w:b/>
-                <w:color w:val="0C8174"/>
-                <w:sz w:val="22"/>
-              </w:rPr>
-              <w:t>Índice de contenidos</w:t>
-            </w:r>
+            <w:pPr>
+              <w:spacing w:after="60" w:line="288" w:lineRule="auto"/>
+            </w:pPr>
+            <w:hyperlink w:anchor="bm__ndice_de_contenidos">
+              <w:r>
+                <w:rPr>
+                  <w:rFonts w:ascii="Carlito" w:hAnsi="Carlito"/>
+                  <w:sz w:val="22"/>
+                  <w:b/>
+                  <w:color w:val="3C5168"/>
+                </w:rPr>
+                <w:t xml:space="preserve">Índice de contenidos</w:t>
+              </w:r>
+            </w:hyperlink>
           </w:p>
         </w:tc>
         <w:tc>
@@ -324,13 +343,16 @@
             <w:pPr>
               <w:jc w:val="right"/>
             </w:pPr>
-            <w:r>
-              <w:rPr>
-                <w:color w:val="16242B"/>
-                <w:sz w:val="20"/>
-              </w:rPr>
-              <w:t>3</w:t>
-            </w:r>
+            <w:hyperlink w:anchor="bm__ndice_de_contenidos">
+              <w:r>
+                <w:rPr>
+                  <w:rFonts w:ascii="Carlito" w:hAnsi="Carlito"/>
+                  <w:sz w:val="20"/>
+                  <w:color w:val="16242B"/>
+                </w:rPr>
+                <w:t xml:space="preserve">3</w:t>
+              </w:r>
+            </w:hyperlink>
           </w:p>
         </w:tc>
       </w:tr>
@@ -340,14 +362,20 @@
             <w:tcW w:type="dxa" w:w="4873"/>
           </w:tcPr>
           <w:p>
-            <w:r>
-              <w:rPr>
-                <w:b/>
-                <w:color w:val="0C8174"/>
-                <w:sz w:val="22"/>
-              </w:rPr>
-              <w:t>1. Introducción</w:t>
-            </w:r>
+            <w:pPr>
+              <w:spacing w:after="60" w:line="288" w:lineRule="auto"/>
+            </w:pPr>
+            <w:hyperlink w:anchor="bm_1__Introducci_n">
+              <w:r>
+                <w:rPr>
+                  <w:rFonts w:ascii="Carlito" w:hAnsi="Carlito"/>
+                  <w:sz w:val="22"/>
+                  <w:b/>
+                  <w:color w:val="3C5168"/>
+                </w:rPr>
+                <w:t xml:space="preserve">1. Introducción</w:t>
+              </w:r>
+            </w:hyperlink>
           </w:p>
         </w:tc>
         <w:tc>
@@ -358,13 +386,16 @@
             <w:pPr>
               <w:jc w:val="right"/>
             </w:pPr>
-            <w:r>
-              <w:rPr>
-                <w:color w:val="16242B"/>
-                <w:sz w:val="20"/>
-              </w:rPr>
-              <w:t>4</w:t>
-            </w:r>
+            <w:hyperlink w:anchor="bm_1__Introducci_n">
+              <w:r>
+                <w:rPr>
+                  <w:rFonts w:ascii="Carlito" w:hAnsi="Carlito"/>
+                  <w:sz w:val="20"/>
+                  <w:color w:val="16242B"/>
+                </w:rPr>
+                <w:t xml:space="preserve">4</w:t>
+              </w:r>
+            </w:hyperlink>
           </w:p>
         </w:tc>
       </w:tr>
@@ -374,14 +405,20 @@
             <w:tcW w:type="dxa" w:w="4873"/>
           </w:tcPr>
           <w:p>
-            <w:r>
-              <w:rPr>
-                <w:b/>
-                <w:color w:val="0C8174"/>
-                <w:sz w:val="22"/>
-              </w:rPr>
-              <w:t>2. Antes de empezar</w:t>
-            </w:r>
+            <w:pPr>
+              <w:spacing w:after="60" w:line="288" w:lineRule="auto"/>
+            </w:pPr>
+            <w:hyperlink w:anchor="bm_2__Antes_de_empezar">
+              <w:r>
+                <w:rPr>
+                  <w:rFonts w:ascii="Carlito" w:hAnsi="Carlito"/>
+                  <w:sz w:val="22"/>
+                  <w:b/>
+                  <w:color w:val="3C5168"/>
+                </w:rPr>
+                <w:t xml:space="preserve">2. Antes de empezar</w:t>
+              </w:r>
+            </w:hyperlink>
           </w:p>
         </w:tc>
         <w:tc>
@@ -392,13 +429,16 @@
             <w:pPr>
               <w:jc w:val="right"/>
             </w:pPr>
-            <w:r>
-              <w:rPr>
-                <w:color w:val="16242B"/>
-                <w:sz w:val="20"/>
-              </w:rPr>
-              <w:t>4</w:t>
-            </w:r>
+            <w:hyperlink w:anchor="bm_2__Antes_de_empezar">
+              <w:r>
+                <w:rPr>
+                  <w:rFonts w:ascii="Carlito" w:hAnsi="Carlito"/>
+                  <w:sz w:val="20"/>
+                  <w:color w:val="16242B"/>
+                </w:rPr>
+                <w:t xml:space="preserve">4</w:t>
+              </w:r>
+            </w:hyperlink>
           </w:p>
         </w:tc>
       </w:tr>
@@ -408,14 +448,20 @@
             <w:tcW w:type="dxa" w:w="4873"/>
           </w:tcPr>
           <w:p>
-            <w:r>
-              <w:rPr>
-                <w:b/>
-                <w:color w:val="0C8174"/>
-                <w:sz w:val="22"/>
-              </w:rPr>
-              <w:t>3. Acceso al sistema</w:t>
-            </w:r>
+            <w:pPr>
+              <w:spacing w:after="60" w:line="288" w:lineRule="auto"/>
+            </w:pPr>
+            <w:hyperlink w:anchor="bm_3__Acceso_al_sistema">
+              <w:r>
+                <w:rPr>
+                  <w:rFonts w:ascii="Carlito" w:hAnsi="Carlito"/>
+                  <w:sz w:val="22"/>
+                  <w:b/>
+                  <w:color w:val="3C5168"/>
+                </w:rPr>
+                <w:t xml:space="preserve">3. Acceso al sistema</w:t>
+              </w:r>
+            </w:hyperlink>
           </w:p>
         </w:tc>
         <w:tc>
@@ -426,13 +472,16 @@
             <w:pPr>
               <w:jc w:val="right"/>
             </w:pPr>
-            <w:r>
-              <w:rPr>
-                <w:color w:val="16242B"/>
-                <w:sz w:val="20"/>
-              </w:rPr>
-              <w:t>6</w:t>
-            </w:r>
+            <w:hyperlink w:anchor="bm_3__Acceso_al_sistema">
+              <w:r>
+                <w:rPr>
+                  <w:rFonts w:ascii="Carlito" w:hAnsi="Carlito"/>
+                  <w:sz w:val="20"/>
+                  <w:color w:val="16242B"/>
+                </w:rPr>
+                <w:t xml:space="preserve">5</w:t>
+              </w:r>
+            </w:hyperlink>
           </w:p>
         </w:tc>
       </w:tr>
@@ -442,14 +491,19 @@
             <w:tcW w:type="dxa" w:w="4873"/>
           </w:tcPr>
           <w:p>
-            <w:r>
-              <w:rPr>
-                <w:b w:val="0"/>
-                <w:color w:val="16242B"/>
-                <w:sz w:val="20"/>
-              </w:rPr>
-              <w:t xml:space="preserve">    4. Panel de control</w:t>
-            </w:r>
+            <w:pPr>
+              <w:spacing w:after="60" w:line="288" w:lineRule="auto"/>
+            </w:pPr>
+            <w:hyperlink w:anchor="bm_4__Panel_de_control">
+              <w:r>
+                <w:rPr>
+                  <w:rFonts w:ascii="Carlito" w:hAnsi="Carlito"/>
+                  <w:sz w:val="20"/>
+                  <w:color w:val="16242B"/>
+                </w:rPr>
+                <w:t xml:space="preserve">        4. Panel de control</w:t>
+              </w:r>
+            </w:hyperlink>
           </w:p>
         </w:tc>
         <w:tc>
@@ -460,13 +514,16 @@
             <w:pPr>
               <w:jc w:val="right"/>
             </w:pPr>
-            <w:r>
-              <w:rPr>
-                <w:color w:val="16242B"/>
-                <w:sz w:val="20"/>
-              </w:rPr>
-              <w:t>7</w:t>
-            </w:r>
+            <w:hyperlink w:anchor="bm_4__Panel_de_control">
+              <w:r>
+                <w:rPr>
+                  <w:rFonts w:ascii="Carlito" w:hAnsi="Carlito"/>
+                  <w:sz w:val="20"/>
+                  <w:color w:val="16242B"/>
+                </w:rPr>
+                <w:t xml:space="preserve">5</w:t>
+              </w:r>
+            </w:hyperlink>
           </w:p>
         </w:tc>
       </w:tr>
@@ -476,14 +533,19 @@
             <w:tcW w:type="dxa" w:w="4873"/>
           </w:tcPr>
           <w:p>
-            <w:r>
-              <w:rPr>
-                <w:b w:val="0"/>
-                <w:color w:val="16242B"/>
-                <w:sz w:val="20"/>
-              </w:rPr>
-              <w:t xml:space="preserve">    4.1 Estado del sistema y gestión</w:t>
-            </w:r>
+            <w:pPr>
+              <w:spacing w:after="60" w:line="288" w:lineRule="auto"/>
+            </w:pPr>
+            <w:hyperlink w:anchor="bm_4_1_Estado_del_sistema_y_gesti_n">
+              <w:r>
+                <w:rPr>
+                  <w:rFonts w:ascii="Carlito" w:hAnsi="Carlito"/>
+                  <w:sz w:val="20"/>
+                  <w:color w:val="16242B"/>
+                </w:rPr>
+                <w:t xml:space="preserve">        4.1 Estado del sistema y gestión</w:t>
+              </w:r>
+            </w:hyperlink>
           </w:p>
         </w:tc>
         <w:tc>
@@ -494,13 +556,16 @@
             <w:pPr>
               <w:jc w:val="right"/>
             </w:pPr>
-            <w:r>
-              <w:rPr>
-                <w:color w:val="16242B"/>
-                <w:sz w:val="20"/>
-              </w:rPr>
-              <w:t>7</w:t>
-            </w:r>
+            <w:hyperlink w:anchor="bm_4_1_Estado_del_sistema_y_gesti_n">
+              <w:r>
+                <w:rPr>
+                  <w:rFonts w:ascii="Carlito" w:hAnsi="Carlito"/>
+                  <w:sz w:val="20"/>
+                  <w:color w:val="16242B"/>
+                </w:rPr>
+                <w:t xml:space="preserve">6</w:t>
+              </w:r>
+            </w:hyperlink>
           </w:p>
         </w:tc>
       </w:tr>
@@ -510,14 +575,19 @@
             <w:tcW w:type="dxa" w:w="4873"/>
           </w:tcPr>
           <w:p>
-            <w:r>
-              <w:rPr>
-                <w:b w:val="0"/>
-                <w:color w:val="16242B"/>
-                <w:sz w:val="20"/>
-              </w:rPr>
-              <w:t xml:space="preserve">    5. Gestión de usuarios</w:t>
-            </w:r>
+            <w:pPr>
+              <w:spacing w:after="60" w:line="288" w:lineRule="auto"/>
+            </w:pPr>
+            <w:hyperlink w:anchor="bm_5__Gesti_n_de_usuarios">
+              <w:r>
+                <w:rPr>
+                  <w:rFonts w:ascii="Carlito" w:hAnsi="Carlito"/>
+                  <w:sz w:val="20"/>
+                  <w:color w:val="16242B"/>
+                </w:rPr>
+                <w:t xml:space="preserve">        5. Gestión de usuarios</w:t>
+              </w:r>
+            </w:hyperlink>
           </w:p>
         </w:tc>
         <w:tc>
@@ -528,13 +598,16 @@
             <w:pPr>
               <w:jc w:val="right"/>
             </w:pPr>
-            <w:r>
-              <w:rPr>
-                <w:color w:val="16242B"/>
-                <w:sz w:val="20"/>
-              </w:rPr>
-              <w:t>8</w:t>
-            </w:r>
+            <w:hyperlink w:anchor="bm_5__Gesti_n_de_usuarios">
+              <w:r>
+                <w:rPr>
+                  <w:rFonts w:ascii="Carlito" w:hAnsi="Carlito"/>
+                  <w:sz w:val="20"/>
+                  <w:color w:val="16242B"/>
+                </w:rPr>
+                <w:t xml:space="preserve">7</w:t>
+              </w:r>
+            </w:hyperlink>
           </w:p>
         </w:tc>
       </w:tr>
@@ -544,14 +617,19 @@
             <w:tcW w:type="dxa" w:w="4873"/>
           </w:tcPr>
           <w:p>
-            <w:r>
-              <w:rPr>
-                <w:b w:val="0"/>
-                <w:color w:val="16242B"/>
-                <w:sz w:val="20"/>
-              </w:rPr>
-              <w:t xml:space="preserve">    6. Contenido educativo</w:t>
-            </w:r>
+            <w:pPr>
+              <w:spacing w:after="60" w:line="288" w:lineRule="auto"/>
+            </w:pPr>
+            <w:hyperlink w:anchor="bm_6__Contenido_educativo">
+              <w:r>
+                <w:rPr>
+                  <w:rFonts w:ascii="Carlito" w:hAnsi="Carlito"/>
+                  <w:sz w:val="20"/>
+                  <w:color w:val="16242B"/>
+                </w:rPr>
+                <w:t xml:space="preserve">        6. Contenido educativo</w:t>
+              </w:r>
+            </w:hyperlink>
           </w:p>
         </w:tc>
         <w:tc>
@@ -562,13 +640,16 @@
             <w:pPr>
               <w:jc w:val="right"/>
             </w:pPr>
-            <w:r>
-              <w:rPr>
-                <w:color w:val="16242B"/>
-                <w:sz w:val="20"/>
-              </w:rPr>
-              <w:t>9</w:t>
-            </w:r>
+            <w:hyperlink w:anchor="bm_6__Contenido_educativo">
+              <w:r>
+                <w:rPr>
+                  <w:rFonts w:ascii="Carlito" w:hAnsi="Carlito"/>
+                  <w:sz w:val="20"/>
+                  <w:color w:val="16242B"/>
+                </w:rPr>
+                <w:t xml:space="preserve">8</w:t>
+              </w:r>
+            </w:hyperlink>
           </w:p>
         </w:tc>
       </w:tr>
@@ -578,14 +659,19 @@
             <w:tcW w:type="dxa" w:w="4873"/>
           </w:tcPr>
           <w:p>
-            <w:r>
-              <w:rPr>
-                <w:b w:val="0"/>
-                <w:color w:val="16242B"/>
-                <w:sz w:val="20"/>
-              </w:rPr>
-              <w:t xml:space="preserve">    7. Canales de notificación</w:t>
-            </w:r>
+            <w:pPr>
+              <w:spacing w:after="60" w:line="288" w:lineRule="auto"/>
+            </w:pPr>
+            <w:hyperlink w:anchor="bm_7__Canales_de_notificaci_n">
+              <w:r>
+                <w:rPr>
+                  <w:rFonts w:ascii="Carlito" w:hAnsi="Carlito"/>
+                  <w:sz w:val="20"/>
+                  <w:color w:val="16242B"/>
+                </w:rPr>
+                <w:t xml:space="preserve">        7. Canales de notificación</w:t>
+              </w:r>
+            </w:hyperlink>
           </w:p>
         </w:tc>
         <w:tc>
@@ -596,13 +682,16 @@
             <w:pPr>
               <w:jc w:val="right"/>
             </w:pPr>
-            <w:r>
-              <w:rPr>
-                <w:color w:val="16242B"/>
-                <w:sz w:val="20"/>
-              </w:rPr>
-              <w:t>10</w:t>
-            </w:r>
+            <w:hyperlink w:anchor="bm_7__Canales_de_notificaci_n">
+              <w:r>
+                <w:rPr>
+                  <w:rFonts w:ascii="Carlito" w:hAnsi="Carlito"/>
+                  <w:sz w:val="20"/>
+                  <w:color w:val="16242B"/>
+                </w:rPr>
+                <w:t xml:space="preserve">9</w:t>
+              </w:r>
+            </w:hyperlink>
           </w:p>
         </w:tc>
       </w:tr>
@@ -612,14 +701,19 @@
             <w:tcW w:type="dxa" w:w="4873"/>
           </w:tcPr>
           <w:p>
-            <w:r>
-              <w:rPr>
-                <w:b w:val="0"/>
-                <w:color w:val="16242B"/>
-                <w:sz w:val="20"/>
-              </w:rPr>
-              <w:t xml:space="preserve">    8. Configuración del sistema</w:t>
-            </w:r>
+            <w:pPr>
+              <w:spacing w:after="60" w:line="288" w:lineRule="auto"/>
+            </w:pPr>
+            <w:hyperlink w:anchor="bm_8__Configuraci_n_del_sistema">
+              <w:r>
+                <w:rPr>
+                  <w:rFonts w:ascii="Carlito" w:hAnsi="Carlito"/>
+                  <w:sz w:val="20"/>
+                  <w:color w:val="16242B"/>
+                </w:rPr>
+                <w:t xml:space="preserve">        8. Configuración del sistema</w:t>
+              </w:r>
+            </w:hyperlink>
           </w:p>
         </w:tc>
         <w:tc>
@@ -630,13 +724,16 @@
             <w:pPr>
               <w:jc w:val="right"/>
             </w:pPr>
-            <w:r>
-              <w:rPr>
-                <w:color w:val="16242B"/>
-                <w:sz w:val="20"/>
-              </w:rPr>
-              <w:t>11</w:t>
-            </w:r>
+            <w:hyperlink w:anchor="bm_8__Configuraci_n_del_sistema">
+              <w:r>
+                <w:rPr>
+                  <w:rFonts w:ascii="Carlito" w:hAnsi="Carlito"/>
+                  <w:sz w:val="20"/>
+                  <w:color w:val="16242B"/>
+                </w:rPr>
+                <w:t xml:space="preserve">10</w:t>
+              </w:r>
+            </w:hyperlink>
           </w:p>
         </w:tc>
       </w:tr>
@@ -646,14 +743,19 @@
             <w:tcW w:type="dxa" w:w="4873"/>
           </w:tcPr>
           <w:p>
-            <w:r>
-              <w:rPr>
-                <w:b w:val="0"/>
-                <w:color w:val="16242B"/>
-                <w:sz w:val="20"/>
-              </w:rPr>
-              <w:t xml:space="preserve">    9. Establecimientos de salud (Sedes)</w:t>
-            </w:r>
+            <w:pPr>
+              <w:spacing w:after="60" w:line="288" w:lineRule="auto"/>
+            </w:pPr>
+            <w:hyperlink w:anchor="bm_9__Establecimientos_de_salud__Sedes_">
+              <w:r>
+                <w:rPr>
+                  <w:rFonts w:ascii="Carlito" w:hAnsi="Carlito"/>
+                  <w:sz w:val="20"/>
+                  <w:color w:val="16242B"/>
+                </w:rPr>
+                <w:t xml:space="preserve">        9. Establecimientos de salud (Sedes)</w:t>
+              </w:r>
+            </w:hyperlink>
           </w:p>
         </w:tc>
         <w:tc>
@@ -664,13 +766,16 @@
             <w:pPr>
               <w:jc w:val="right"/>
             </w:pPr>
-            <w:r>
-              <w:rPr>
-                <w:color w:val="16242B"/>
-                <w:sz w:val="20"/>
-              </w:rPr>
-              <w:t>12</w:t>
-            </w:r>
+            <w:hyperlink w:anchor="bm_9__Establecimientos_de_salud__Sedes_">
+              <w:r>
+                <w:rPr>
+                  <w:rFonts w:ascii="Carlito" w:hAnsi="Carlito"/>
+                  <w:sz w:val="20"/>
+                  <w:color w:val="16242B"/>
+                </w:rPr>
+                <w:t xml:space="preserve">11</w:t>
+              </w:r>
+            </w:hyperlink>
           </w:p>
         </w:tc>
       </w:tr>
@@ -680,14 +785,19 @@
             <w:tcW w:type="dxa" w:w="4873"/>
           </w:tcPr>
           <w:p>
-            <w:r>
-              <w:rPr>
-                <w:b w:val="0"/>
-                <w:color w:val="16242B"/>
-                <w:sz w:val="20"/>
-              </w:rPr>
-              <w:t xml:space="preserve">    10. Auditoría y backup</w:t>
-            </w:r>
+            <w:pPr>
+              <w:spacing w:after="60" w:line="288" w:lineRule="auto"/>
+            </w:pPr>
+            <w:hyperlink w:anchor="bm_10__Auditor_a_y_backup">
+              <w:r>
+                <w:rPr>
+                  <w:rFonts w:ascii="Carlito" w:hAnsi="Carlito"/>
+                  <w:sz w:val="20"/>
+                  <w:color w:val="16242B"/>
+                </w:rPr>
+                <w:t xml:space="preserve">        10. Auditoría y backup</w:t>
+              </w:r>
+            </w:hyperlink>
           </w:p>
         </w:tc>
         <w:tc>
@@ -698,13 +808,16 @@
             <w:pPr>
               <w:jc w:val="right"/>
             </w:pPr>
-            <w:r>
-              <w:rPr>
-                <w:color w:val="16242B"/>
-                <w:sz w:val="20"/>
-              </w:rPr>
-              <w:t>13</w:t>
-            </w:r>
+            <w:hyperlink w:anchor="bm_10__Auditor_a_y_backup">
+              <w:r>
+                <w:rPr>
+                  <w:rFonts w:ascii="Carlito" w:hAnsi="Carlito"/>
+                  <w:sz w:val="20"/>
+                  <w:color w:val="16242B"/>
+                </w:rPr>
+                <w:t xml:space="preserve">12</w:t>
+              </w:r>
+            </w:hyperlink>
           </w:p>
         </w:tc>
       </w:tr>
@@ -714,14 +827,20 @@
             <w:tcW w:type="dxa" w:w="4873"/>
           </w:tcPr>
           <w:p>
-            <w:r>
-              <w:rPr>
-                <w:b/>
-                <w:color w:val="0C8174"/>
-                <w:sz w:val="22"/>
-              </w:rPr>
-              <w:t>Solución de problemas</w:t>
-            </w:r>
+            <w:pPr>
+              <w:spacing w:after="60" w:line="288" w:lineRule="auto"/>
+            </w:pPr>
+            <w:hyperlink w:anchor="bm_Soluci_n_de_problemas">
+              <w:r>
+                <w:rPr>
+                  <w:rFonts w:ascii="Carlito" w:hAnsi="Carlito"/>
+                  <w:sz w:val="22"/>
+                  <w:b/>
+                  <w:color w:val="3C5168"/>
+                </w:rPr>
+                <w:t xml:space="preserve">Solución de problemas</w:t>
+              </w:r>
+            </w:hyperlink>
           </w:p>
         </w:tc>
         <w:tc>
@@ -732,13 +851,16 @@
             <w:pPr>
               <w:jc w:val="right"/>
             </w:pPr>
-            <w:r>
-              <w:rPr>
-                <w:color w:val="16242B"/>
-                <w:sz w:val="20"/>
-              </w:rPr>
-              <w:t>15</w:t>
-            </w:r>
+            <w:hyperlink w:anchor="bm_Soluci_n_de_problemas">
+              <w:r>
+                <w:rPr>
+                  <w:rFonts w:ascii="Carlito" w:hAnsi="Carlito"/>
+                  <w:sz w:val="20"/>
+                  <w:color w:val="16242B"/>
+                </w:rPr>
+                <w:t xml:space="preserve">13</w:t>
+              </w:r>
+            </w:hyperlink>
           </w:p>
         </w:tc>
       </w:tr>
@@ -748,14 +870,20 @@
             <w:tcW w:type="dxa" w:w="4873"/>
           </w:tcPr>
           <w:p>
-            <w:r>
-              <w:rPr>
-                <w:b/>
-                <w:color w:val="0C8174"/>
-                <w:sz w:val="22"/>
-              </w:rPr>
-              <w:t>Preguntas frecuentes</w:t>
-            </w:r>
+            <w:pPr>
+              <w:spacing w:after="60" w:line="288" w:lineRule="auto"/>
+            </w:pPr>
+            <w:hyperlink w:anchor="bm_Preguntas_frecuentes">
+              <w:r>
+                <w:rPr>
+                  <w:rFonts w:ascii="Carlito" w:hAnsi="Carlito"/>
+                  <w:sz w:val="22"/>
+                  <w:b/>
+                  <w:color w:val="3C5168"/>
+                </w:rPr>
+                <w:t xml:space="preserve">Preguntas frecuentes</w:t>
+              </w:r>
+            </w:hyperlink>
           </w:p>
         </w:tc>
         <w:tc>
@@ -766,13 +894,16 @@
             <w:pPr>
               <w:jc w:val="right"/>
             </w:pPr>
-            <w:r>
-              <w:rPr>
-                <w:color w:val="16242B"/>
-                <w:sz w:val="20"/>
-              </w:rPr>
-              <w:t>15</w:t>
-            </w:r>
+            <w:hyperlink w:anchor="bm_Preguntas_frecuentes">
+              <w:r>
+                <w:rPr>
+                  <w:rFonts w:ascii="Carlito" w:hAnsi="Carlito"/>
+                  <w:sz w:val="20"/>
+                  <w:color w:val="16242B"/>
+                </w:rPr>
+                <w:t xml:space="preserve">14</w:t>
+              </w:r>
+            </w:hyperlink>
           </w:p>
         </w:tc>
       </w:tr>
@@ -782,14 +913,20 @@
             <w:tcW w:type="dxa" w:w="4873"/>
           </w:tcPr>
           <w:p>
-            <w:r>
-              <w:rPr>
-                <w:b/>
-                <w:color w:val="0C8174"/>
-                <w:sz w:val="22"/>
-              </w:rPr>
-              <w:t>Glosario</w:t>
-            </w:r>
+            <w:pPr>
+              <w:spacing w:after="60" w:line="288" w:lineRule="auto"/>
+            </w:pPr>
+            <w:hyperlink w:anchor="bm_Glosario">
+              <w:r>
+                <w:rPr>
+                  <w:rFonts w:ascii="Carlito" w:hAnsi="Carlito"/>
+                  <w:sz w:val="22"/>
+                  <w:b/>
+                  <w:color w:val="3C5168"/>
+                </w:rPr>
+                <w:t xml:space="preserve">Glosario</w:t>
+              </w:r>
+            </w:hyperlink>
           </w:p>
         </w:tc>
         <w:tc>
@@ -800,13 +937,16 @@
             <w:pPr>
               <w:jc w:val="right"/>
             </w:pPr>
-            <w:r>
-              <w:rPr>
-                <w:color w:val="16242B"/>
-                <w:sz w:val="20"/>
-              </w:rPr>
-              <w:t>15</w:t>
-            </w:r>
+            <w:hyperlink w:anchor="bm_Glosario">
+              <w:r>
+                <w:rPr>
+                  <w:rFonts w:ascii="Carlito" w:hAnsi="Carlito"/>
+                  <w:sz w:val="20"/>
+                  <w:color w:val="16242B"/>
+                </w:rPr>
+                <w:t xml:space="preserve">14</w:t>
+              </w:r>
+            </w:hyperlink>
           </w:p>
         </w:tc>
       </w:tr>
@@ -816,14 +956,20 @@
             <w:tcW w:type="dxa" w:w="4873"/>
           </w:tcPr>
           <w:p>
-            <w:r>
-              <w:rPr>
-                <w:b/>
-                <w:color w:val="0C8174"/>
-                <w:sz w:val="22"/>
-              </w:rPr>
-              <w:t>Soporte y contacto</w:t>
-            </w:r>
+            <w:pPr>
+              <w:spacing w:after="60" w:line="288" w:lineRule="auto"/>
+            </w:pPr>
+            <w:hyperlink w:anchor="bm_Soporte_y_contacto">
+              <w:r>
+                <w:rPr>
+                  <w:rFonts w:ascii="Carlito" w:hAnsi="Carlito"/>
+                  <w:sz w:val="22"/>
+                  <w:b/>
+                  <w:color w:val="3C5168"/>
+                </w:rPr>
+                <w:t xml:space="preserve">Soporte y contacto</w:t>
+              </w:r>
+            </w:hyperlink>
           </w:p>
         </w:tc>
         <w:tc>
@@ -834,13 +980,16 @@
             <w:pPr>
               <w:jc w:val="right"/>
             </w:pPr>
-            <w:r>
-              <w:rPr>
-                <w:color w:val="16242B"/>
-                <w:sz w:val="20"/>
-              </w:rPr>
-              <w:t>16</w:t>
-            </w:r>
+            <w:hyperlink w:anchor="bm_Soporte_y_contacto">
+              <w:r>
+                <w:rPr>
+                  <w:rFonts w:ascii="Carlito" w:hAnsi="Carlito"/>
+                  <w:sz w:val="20"/>
+                  <w:color w:val="16242B"/>
+                </w:rPr>
+                <w:t xml:space="preserve">14</w:t>
+              </w:r>
+            </w:hyperlink>
           </w:p>
         </w:tc>
       </w:tr>
@@ -851,6 +1000,7 @@
       </w:r>
     </w:p>
     <w:p>
+      <w:bookmarkStart w:id="1002" w:name="bm_1__Introducci_n"/>
       <w:pPr>
         <w:pStyle w:val="Heading1"/>
         <w:pBdr>
@@ -860,6 +1010,7 @@
       <w:r>
         <w:t>1. Introducción</w:t>
       </w:r>
+      <w:bookmarkEnd w:id="1002"/>
     </w:p>
     <w:p>
       <w:pPr>
@@ -910,6 +1061,7 @@
       </w:r>
     </w:p>
     <w:p>
+      <w:bookmarkStart w:id="1003" w:name="bm_2__Antes_de_empezar"/>
       <w:pPr>
         <w:pStyle w:val="Heading1"/>
         <w:pBdr>
@@ -919,6 +1071,7 @@
       <w:r>
         <w:t>2. Antes de empezar</w:t>
       </w:r>
+      <w:bookmarkEnd w:id="1003"/>
     </w:p>
     <w:p>
       <w:pPr>
@@ -1066,11 +1219,12 @@
       </w:tr>
     </w:tbl>
     <w:p>
-      <w:r>
-        <w:br w:type="page"/>
-      </w:r>
+      <w:pPr>
+        <w:spacing w:after="200"/>
+      </w:pPr>
     </w:p>
     <w:p>
+      <w:bookmarkStart w:id="1004" w:name="bm_3__Acceso_al_sistema"/>
       <w:pPr>
         <w:pStyle w:val="Heading1"/>
         <w:pBdr>
@@ -1080,6 +1234,7 @@
       <w:r>
         <w:t>3. Acceso al sistema</w:t>
       </w:r>
+      <w:bookmarkEnd w:id="1004"/>
     </w:p>
     <w:p>
       <w:pPr>
@@ -1095,7 +1250,7 @@
         <w:spacing w:after="120" w:line="312" w:lineRule="auto"/>
       </w:pPr>
       <w:r>
-        <w:t>En el campo «DNI», escribe tu número de documento.</w:t>
+        <w:t>En el campo “DNI”, escribe tu número de documento.</w:t>
       </w:r>
     </w:p>
     <w:p>
@@ -1104,7 +1259,7 @@
         <w:spacing w:after="120" w:line="312" w:lineRule="auto"/>
       </w:pPr>
       <w:r>
-        <w:t>En el campo «Contraseña», escribe tu contraseña.</w:t>
+        <w:t>En el campo “Contraseña”, escribe tu contraseña.</w:t>
       </w:r>
     </w:p>
     <w:p>
@@ -1113,11 +1268,14 @@
         <w:spacing w:after="120" w:line="312" w:lineRule="auto"/>
       </w:pPr>
       <w:r>
-        <w:t>Toca el botón «Iniciar Sesión» para ingresar.</w:t>
+        <w:t>Toca el botón “Iniciar Sesión” para ingresar.</w:t>
       </w:r>
     </w:p>
     <w:p>
       <w:pPr>
+        <w:keepNext/>
+        <w:keepLines/>
+        <w:spacing w:before="80"/>
         <w:jc w:val="center"/>
       </w:pPr>
       <w:r>
@@ -1208,7 +1366,7 @@
                 <w:color w:val="16242B"/>
                 <w:sz w:val="20"/>
               </w:rPr>
-              <w:t>Durante el primer ingreso se mostrará el recorrido guiado «Conoce tu app», que puede repetirse en cualquier momento desde el perfil.</w:t>
+              <w:t>Durante el primer ingreso se mostrará el recorrido guiado “Conoce tu app”, que puede repetirse en cualquier momento desde el perfil.</w:t>
             </w:r>
           </w:p>
         </w:tc>
@@ -1220,17 +1378,19 @@
       </w:pPr>
     </w:p>
     <w:p>
-      <w:r>
-        <w:br w:type="page"/>
-      </w:r>
+      <w:pPr>
+        <w:spacing w:after="200"/>
+      </w:pPr>
     </w:p>
     <w:p>
+      <w:bookmarkStart w:id="1005" w:name="bm_4__Panel_de_control"/>
       <w:pPr>
         <w:pStyle w:val="Heading2"/>
       </w:pPr>
       <w:r>
         <w:t>4. Panel de control</w:t>
       </w:r>
+      <w:bookmarkEnd w:id="1005"/>
     </w:p>
     <w:p>
       <w:pPr>
@@ -1246,7 +1406,7 @@
         <w:spacing w:after="120" w:line="312" w:lineRule="auto"/>
       </w:pPr>
       <w:r>
-        <w:t>① «Cuentas por aprobar»: si hay obstetras o gestantes esperando aprobación, aparecen aquí para resolverlo.</w:t>
+        <w:t>① “Cuentas por aprobar”: si hay obstetras o gestantes esperando aprobación, aparecen aquí para resolverlo.</w:t>
       </w:r>
     </w:p>
     <w:p>
@@ -1255,11 +1415,14 @@
         <w:spacing w:after="120" w:line="312" w:lineRule="auto"/>
       </w:pPr>
       <w:r>
-        <w:t>② «Resumen»: las cifras clave (usuarios, gestantes activas, alto riesgo y citas del día).</w:t>
+        <w:t>② “Resumen”: las cifras clave (usuarios, gestantes activas, alto riesgo y citas del día).</w:t>
       </w:r>
     </w:p>
     <w:p>
       <w:pPr>
+        <w:keepNext/>
+        <w:keepLines/>
+        <w:spacing w:before="80"/>
         <w:jc w:val="center"/>
       </w:pPr>
       <w:r>
@@ -1312,12 +1475,14 @@
       </w:r>
     </w:p>
     <w:p>
+      <w:bookmarkStart w:id="1006" w:name="bm_4_1_Estado_del_sistema_y_gesti_n"/>
       <w:pPr>
         <w:pStyle w:val="Heading2"/>
       </w:pPr>
       <w:r>
         <w:t>4.1 Estado del sistema y gestión</w:t>
       </w:r>
+      <w:bookmarkEnd w:id="1006"/>
     </w:p>
     <w:p>
       <w:pPr>
@@ -1333,7 +1498,7 @@
         <w:spacing w:after="120" w:line="312" w:lineRule="auto"/>
       </w:pPr>
       <w:r>
-        <w:t>① «Estado del sistema»: alertas, contenido publicado y si los canales SMS/WhatsApp están activos.</w:t>
+        <w:t>① “Estado del sistema”: alertas, contenido publicado y si los canales SMS/WhatsApp están activos.</w:t>
       </w:r>
     </w:p>
     <w:p>
@@ -1342,11 +1507,14 @@
         <w:spacing w:after="120" w:line="312" w:lineRule="auto"/>
       </w:pPr>
       <w:r>
-        <w:t>② «Gestión»: accesos rápidos a Usuarios, Contenido y Reportes.</w:t>
+        <w:t>② “Gestión”: accesos rápidos a Usuarios, Contenido y Reportes.</w:t>
       </w:r>
     </w:p>
     <w:p>
       <w:pPr>
+        <w:keepNext/>
+        <w:keepLines/>
+        <w:spacing w:before="80"/>
         <w:jc w:val="center"/>
       </w:pPr>
       <w:r>
@@ -1399,12 +1567,14 @@
       </w:r>
     </w:p>
     <w:p>
+      <w:bookmarkStart w:id="1007" w:name="bm_5__Gesti_n_de_usuarios"/>
       <w:pPr>
         <w:pStyle w:val="Heading2"/>
       </w:pPr>
       <w:r>
         <w:t>5. Gestión de usuarios</w:t>
       </w:r>
+      <w:bookmarkEnd w:id="1007"/>
     </w:p>
     <w:p>
       <w:pPr>
@@ -1420,11 +1590,14 @@
         <w:spacing w:after="120" w:line="312" w:lineRule="auto"/>
       </w:pPr>
       <w:r>
-        <w:t>① Buscador por nombre o DNI. En cada usuario puedes ver su ficha, aprobar la cuenta, activarla o desactivarla, editar sus datos, cambiar la contraseña o eliminarlo. Para crear una cuenta nueva usa el botón «+» (o «Nuevo usuario» en el portal web) y elige el rol.</w:t>
+        <w:t>① Buscador por nombre o DNI. En cada usuario puedes ver su ficha, aprobar la cuenta, activarla o desactivarla, editar sus datos, cambiar la contraseña o eliminarlo. Para crear una cuenta nueva usa el botón “+” (o “Nuevo usuario” en el portal web) y elige el rol.</w:t>
       </w:r>
     </w:p>
     <w:p>
       <w:pPr>
+        <w:keepNext/>
+        <w:keepLines/>
+        <w:spacing w:before="80"/>
         <w:jc w:val="center"/>
       </w:pPr>
       <w:r>
@@ -1527,12 +1700,14 @@
       </w:pPr>
     </w:p>
     <w:p>
+      <w:bookmarkStart w:id="1008" w:name="bm_6__Contenido_educativo"/>
       <w:pPr>
         <w:pStyle w:val="Heading2"/>
       </w:pPr>
       <w:r>
         <w:t>6. Contenido educativo</w:t>
       </w:r>
+      <w:bookmarkEnd w:id="1008"/>
     </w:p>
     <w:p>
       <w:pPr>
@@ -1553,6 +1728,9 @@
     </w:p>
     <w:p>
       <w:pPr>
+        <w:keepNext/>
+        <w:keepLines/>
+        <w:spacing w:before="80"/>
         <w:jc w:val="center"/>
       </w:pPr>
       <w:r>
@@ -1605,12 +1783,14 @@
       </w:r>
     </w:p>
     <w:p>
+      <w:bookmarkStart w:id="1009" w:name="bm_7__Canales_de_notificaci_n"/>
       <w:pPr>
         <w:pStyle w:val="Heading2"/>
       </w:pPr>
       <w:r>
         <w:t>7. Canales de notificación</w:t>
       </w:r>
+      <w:bookmarkEnd w:id="1009"/>
     </w:p>
     <w:p>
       <w:pPr>
@@ -1626,11 +1806,14 @@
         <w:spacing w:after="120" w:line="312" w:lineRule="auto"/>
       </w:pPr>
       <w:r>
-        <w:t>① «SMS (Twilio)»: activa el canal y guarda las credenciales; puedes enviar un mensaje de prueba. Más abajo, «WhatsApp (Cloud API)» se configura de forma similar.</w:t>
+        <w:t>① “SMS (Twilio)”: activa el canal y guarda las credenciales; puedes enviar un mensaje de prueba. Más abajo, “WhatsApp (Cloud API)” se configura de forma similar.</w:t>
       </w:r>
     </w:p>
     <w:p>
       <w:pPr>
+        <w:keepNext/>
+        <w:keepLines/>
+        <w:spacing w:before="80"/>
         <w:jc w:val="center"/>
       </w:pPr>
       <w:r>
@@ -1721,7 +1904,7 @@
                 <w:color w:val="16242B"/>
                 <w:sz w:val="20"/>
               </w:rPr>
-              <w:t>Mientras un canal no esté configurado, el sistema opera en «modo prueba» y no envía mensajes reales.</w:t>
+              <w:t>Mientras un canal no esté configurado, el sistema opera en “modo prueba” y no envía mensajes reales.</w:t>
             </w:r>
           </w:p>
         </w:tc>
@@ -1733,12 +1916,14 @@
       </w:pPr>
     </w:p>
     <w:p>
+      <w:bookmarkStart w:id="1010" w:name="bm_8__Configuraci_n_del_sistema"/>
       <w:pPr>
         <w:pStyle w:val="Heading2"/>
       </w:pPr>
       <w:r>
         <w:t>8. Configuración del sistema</w:t>
       </w:r>
+      <w:bookmarkEnd w:id="1010"/>
     </w:p>
     <w:p>
       <w:pPr>
@@ -1754,11 +1939,14 @@
         <w:spacing w:after="120" w:line="312" w:lineRule="auto"/>
       </w:pPr>
       <w:r>
-        <w:t>① «Límites y Accesos»: máximo de pacientes por obstetra y si se permiten nuevos registros. Más abajo: parámetros clínicos (altitud para corregir la hemoglobina), generación automática de cronogramas y el modo mantenimiento.</w:t>
+        <w:t>① “Límites y Accesos”: máximo de pacientes por obstetra y si se permiten nuevos registros. Más abajo: parámetros clínicos (altitud para corregir la hemoglobina), generación automática de cronogramas y el modo mantenimiento.</w:t>
       </w:r>
     </w:p>
     <w:p>
       <w:pPr>
+        <w:keepNext/>
+        <w:keepLines/>
+        <w:spacing w:before="80"/>
         <w:jc w:val="center"/>
       </w:pPr>
       <w:r>
@@ -1849,7 +2037,7 @@
                 <w:color w:val="16242B"/>
                 <w:sz w:val="20"/>
               </w:rPr>
-              <w:t>El «modo mantenimiento» bloquea el acceso a gestantes y obstetras (tú conservas el acceso). Úsalo solo durante actualizaciones.</w:t>
+              <w:t>El “modo mantenimiento” bloquea el acceso a gestantes y obstetras (tú conservas el acceso). Úsalo solo durante actualizaciones.</w:t>
             </w:r>
           </w:p>
         </w:tc>
@@ -1861,12 +2049,14 @@
       </w:pPr>
     </w:p>
     <w:p>
+      <w:bookmarkStart w:id="1011" w:name="bm_9__Establecimientos_de_salud__Sedes_"/>
       <w:pPr>
         <w:pStyle w:val="Heading2"/>
       </w:pPr>
       <w:r>
         <w:t>9. Establecimientos de salud (Sedes)</w:t>
       </w:r>
+      <w:bookmarkEnd w:id="1011"/>
     </w:p>
     <w:p>
       <w:pPr>
@@ -1882,11 +2072,14 @@
         <w:spacing w:after="120" w:line="312" w:lineRule="auto"/>
       </w:pPr>
       <w:r>
-        <w:t>① Toca el botón «Crear establecimiento» para registrar una sede nueva (nombre, código, dirección, teléfono, altitud y servicios). En cada sede puedes editar o eliminar.</w:t>
+        <w:t>① Toca el botón “Crear establecimiento” para registrar una sede nueva (nombre, código, dirección, teléfono, altitud y servicios). En cada sede puedes editar o eliminar.</w:t>
       </w:r>
     </w:p>
     <w:p>
       <w:pPr>
+        <w:keepNext/>
+        <w:keepLines/>
+        <w:spacing w:before="80"/>
         <w:jc w:val="center"/>
       </w:pPr>
       <w:r>
@@ -1939,12 +2132,14 @@
       </w:r>
     </w:p>
     <w:p>
+      <w:bookmarkStart w:id="1012" w:name="bm_10__Auditor_a_y_backup"/>
       <w:pPr>
         <w:pStyle w:val="Heading2"/>
       </w:pPr>
       <w:r>
         <w:t>10. Auditoría y backup</w:t>
       </w:r>
+      <w:bookmarkEnd w:id="1012"/>
     </w:p>
     <w:p>
       <w:pPr>
@@ -1960,11 +2155,14 @@
         <w:spacing w:after="120" w:line="312" w:lineRule="auto"/>
       </w:pPr>
       <w:r>
-        <w:t>① «Exportar Backup BD»: descarga un respaldo completo de la base de datos. Más abajo se muestra el registro de auditoría (quién hizo qué y cuándo).</w:t>
+        <w:t>① “Exportar Backup BD”: descarga un respaldo completo de la base de datos. Más abajo se muestra el registro de auditoría (quién hizo qué y cuándo).</w:t>
       </w:r>
     </w:p>
     <w:p>
       <w:pPr>
+        <w:keepNext/>
+        <w:keepLines/>
+        <w:spacing w:before="80"/>
         <w:jc w:val="center"/>
       </w:pPr>
       <w:r>
@@ -2017,11 +2215,12 @@
       </w:r>
     </w:p>
     <w:p>
-      <w:r>
-        <w:br w:type="page"/>
-      </w:r>
+      <w:pPr>
+        <w:spacing w:after="200"/>
+      </w:pPr>
     </w:p>
     <w:p>
+      <w:bookmarkStart w:id="1013" w:name="bm_Soluci_n_de_problemas"/>
       <w:pPr>
         <w:pStyle w:val="Heading1"/>
         <w:pBdr>
@@ -2031,6 +2230,7 @@
       <w:r>
         <w:t>Solución de problemas</w:t>
       </w:r>
+      <w:bookmarkEnd w:id="1013"/>
     </w:p>
     <w:p>
       <w:pPr>
@@ -2053,7 +2253,7 @@
         <w:pStyle w:val="Heading3"/>
       </w:pPr>
       <w:r>
-        <w:t>Los canales siguen en «modo prueba»</w:t>
+        <w:t>Los canales siguen en “modo prueba”</w:t>
       </w:r>
     </w:p>
     <w:p>
@@ -2081,6 +2281,7 @@
       </w:r>
     </w:p>
     <w:p>
+      <w:bookmarkStart w:id="1014" w:name="bm_Preguntas_frecuentes"/>
       <w:pPr>
         <w:pStyle w:val="Heading1"/>
         <w:pBdr>
@@ -2090,6 +2291,7 @@
       <w:r>
         <w:t>Preguntas frecuentes</w:t>
       </w:r>
+      <w:bookmarkEnd w:id="1014"/>
     </w:p>
     <w:p>
       <w:pPr>
@@ -2104,7 +2306,7 @@
         <w:jc w:val="both"/>
       </w:pPr>
       <w:r>
-        <w:t>Desde el inicio o desde «Usuarios», abre la cuenta pendiente y toca «Aprobar».</w:t>
+        <w:t>Desde el inicio o desde “Usuarios”, abre la cuenta pendiente y toca “Aprobar”.</w:t>
       </w:r>
     </w:p>
     <w:p>
@@ -2120,7 +2322,7 @@
         <w:jc w:val="both"/>
       </w:pPr>
       <w:r>
-        <w:t>En «Contenido», usa el botón de crear, completa los datos y guárdalo.</w:t>
+        <w:t>En “Contenido”, usa el botón de crear, completa los datos y guárdalo.</w:t>
       </w:r>
     </w:p>
     <w:p>
@@ -2136,10 +2338,11 @@
         <w:jc w:val="both"/>
       </w:pPr>
       <w:r>
-        <w:t>En «Auditoría y backup», usa «Exportar Backup BD».</w:t>
+        <w:t>En “Auditoría y backup”, usa “Exportar Backup BD”.</w:t>
       </w:r>
     </w:p>
     <w:p>
+      <w:bookmarkStart w:id="1015" w:name="bm_Glosario"/>
       <w:pPr>
         <w:pStyle w:val="Heading1"/>
         <w:pBdr>
@@ -2149,6 +2352,7 @@
       <w:r>
         <w:t>Glosario</w:t>
       </w:r>
+      <w:bookmarkEnd w:id="1015"/>
     </w:p>
     <w:p>
       <w:r>
@@ -2206,6 +2410,7 @@
       </w:r>
     </w:p>
     <w:p>
+      <w:bookmarkStart w:id="1016" w:name="bm_Soporte_y_contacto"/>
       <w:pPr>
         <w:pStyle w:val="Heading1"/>
         <w:pBdr>
@@ -2215,6 +2420,7 @@
       <w:r>
         <w:t>Soporte y contacto</w:t>
       </w:r>
+      <w:bookmarkEnd w:id="1016"/>
     </w:p>
     <w:p>
       <w:pPr>
@@ -2688,7 +2894,7 @@
       <w:spacing w:line="336" w:lineRule="auto" w:after="160" w:before="0"/>
     </w:pPr>
     <w:rPr>
-      <w:rFonts w:ascii="Calibri" w:hAnsi="Calibri"/>
+      <w:rFonts w:ascii="Carlito" w:hAnsi="Carlito"/>
       <w:color w:val="16242B"/>
       <w:sz w:val="22"/>
     </w:rPr>
@@ -2752,7 +2958,7 @@
       <w:outlineLvl w:val="0"/>
     </w:pPr>
     <w:rPr>
-      <w:rFonts w:asciiTheme="majorHAnsi" w:eastAsiaTheme="majorEastAsia" w:hAnsiTheme="majorHAnsi" w:cstheme="majorBidi" w:ascii="Calibri" w:hAnsi="Calibri"/>
+      <w:rFonts w:asciiTheme="majorHAnsi" w:eastAsiaTheme="majorEastAsia" w:hAnsiTheme="majorHAnsi" w:cstheme="majorBidi" w:ascii="Carlito" w:hAnsi="Carlito"/>
       <w:b/>
       <w:bCs/>
       <w:i w:val="0"/>
@@ -2777,7 +2983,7 @@
       <w:outlineLvl w:val="1"/>
     </w:pPr>
     <w:rPr>
-      <w:rFonts w:asciiTheme="majorHAnsi" w:eastAsiaTheme="majorEastAsia" w:hAnsiTheme="majorHAnsi" w:cstheme="majorBidi" w:ascii="Calibri" w:hAnsi="Calibri"/>
+      <w:rFonts w:asciiTheme="majorHAnsi" w:eastAsiaTheme="majorEastAsia" w:hAnsiTheme="majorHAnsi" w:cstheme="majorBidi" w:ascii="Carlito" w:hAnsi="Carlito"/>
       <w:b/>
       <w:bCs/>
       <w:i w:val="0"/>
@@ -2802,7 +3008,7 @@
       <w:outlineLvl w:val="2"/>
     </w:pPr>
     <w:rPr>
-      <w:rFonts w:asciiTheme="majorHAnsi" w:eastAsiaTheme="majorEastAsia" w:hAnsiTheme="majorHAnsi" w:cstheme="majorBidi" w:ascii="Calibri" w:hAnsi="Calibri"/>
+      <w:rFonts w:asciiTheme="majorHAnsi" w:eastAsiaTheme="majorEastAsia" w:hAnsiTheme="majorHAnsi" w:cstheme="majorBidi" w:ascii="Carlito" w:hAnsi="Carlito"/>
       <w:b/>
       <w:bCs/>
       <w:i w:val="0"/>

</xml_diff>

<commit_message>
docs(manual): quita el teléfono, negritas en comillas y tabla ordenada
- elimina el número 083 – 421800 (queda sin teléfono) en los 3 manuales
- resalta en negrita los nombres entre comillas (botones, campos, secciones)
  para mayor claridad y profesionalismo
- rediseña la tabla de convenciones: fila de encabezado con color, columnas de
  ancho fijo, padding y primera columna en negrita
</commit_message>
<xml_diff>
--- a/docs/manual/build/manual_usuario_admin_vitmaterna_movil.docx
+++ b/docs/manual/build/manual_usuario_admin_vitmaterna_movil.docx
@@ -179,6 +179,9 @@
         <w:jc w:val="both"/>
       </w:pPr>
       <w:r>
+        <w:rPr>
+          <w:sz w:val="22"/>
+        </w:rPr>
         <w:t>Este documento es el manual de usuario oficial de la aplicación móvil VITMATERNA, plataforma de seguimiento de salud prenatal. Se entrega con fines de capacitación y uso del sistema.</w:t>
       </w:r>
     </w:p>
@@ -187,6 +190,9 @@
         <w:jc w:val="both"/>
       </w:pPr>
       <w:r>
+        <w:rPr>
+          <w:sz w:val="22"/>
+        </w:rPr>
         <w:t>La información que aparece en las capturas corresponde a datos de demostración y no representa a personas reales. El manejo de datos de salud se realiza conforme a la normativa de protección de datos personales vigente.</w:t>
       </w:r>
     </w:p>
@@ -1025,6 +1031,9 @@
         <w:jc w:val="both"/>
       </w:pPr>
       <w:r>
+        <w:rPr>
+          <w:sz w:val="22"/>
+        </w:rPr>
         <w:t>VITMATERNA es la plataforma cuyo panel de administración te permite controlar todo el sistema: aprobar y gestionar usuarios, publicar contenido educativo, configurar los canales de notificación (SMS y WhatsApp), ajustar parámetros del sistema, administrar las sedes y revisar la auditoría.</w:t>
       </w:r>
     </w:p>
@@ -1041,6 +1050,9 @@
         <w:jc w:val="both"/>
       </w:pPr>
       <w:r>
+        <w:rPr>
+          <w:sz w:val="22"/>
+        </w:rPr>
         <w:t>Este manual está dirigido al personal administrador del sistema y tiene como objetivo guiar la configuración y gestión de la plataforma, mediante instrucciones paso a paso acompañadas de capturas de pantalla.</w:t>
       </w:r>
     </w:p>
@@ -1057,6 +1069,9 @@
         <w:jc w:val="both"/>
       </w:pPr>
       <w:r>
+        <w:rPr>
+          <w:sz w:val="22"/>
+        </w:rPr>
         <w:t>El documento abarca el panel de control, la gestión de usuarios, el contenido educativo, los canales de notificación, la configuración del sistema, la administración de sedes y la auditoría.</w:t>
       </w:r>
     </w:p>
@@ -1086,6 +1101,9 @@
         <w:jc w:val="both"/>
       </w:pPr>
       <w:r>
+        <w:rPr>
+          <w:sz w:val="22"/>
+        </w:rPr>
         <w:t>Para utilizar la aplicación es necesario contar con:</w:t>
       </w:r>
     </w:p>
@@ -1095,6 +1113,9 @@
         <w:spacing w:after="80" w:line="312" w:lineRule="auto"/>
       </w:pPr>
       <w:r>
+        <w:rPr>
+          <w:sz w:val="22"/>
+        </w:rPr>
         <w:t>Un teléfono móvil con sistema operativo Android o iOS (iPhone).</w:t>
       </w:r>
     </w:p>
@@ -1104,6 +1125,9 @@
         <w:spacing w:after="80" w:line="312" w:lineRule="auto"/>
       </w:pPr>
       <w:r>
+        <w:rPr>
+          <w:sz w:val="22"/>
+        </w:rPr>
         <w:t>Conexión a internet (datos móviles o red wifi).</w:t>
       </w:r>
     </w:p>
@@ -1113,6 +1137,9 @@
         <w:spacing w:after="80" w:line="312" w:lineRule="auto"/>
       </w:pPr>
       <w:r>
+        <w:rPr>
+          <w:sz w:val="22"/>
+        </w:rPr>
         <w:t>Las credenciales de acceso: número de DNI y contraseña.</w:t>
       </w:r>
     </w:p>
@@ -1129,13 +1156,18 @@
         <w:jc w:val="both"/>
       </w:pPr>
       <w:r>
+        <w:rPr>
+          <w:sz w:val="22"/>
+        </w:rPr>
         <w:t>En las imágenes verás marcas numeradas y recuadros que indican exactamente de qué elemento se habla y en qué orden usarlo:</w:t>
       </w:r>
     </w:p>
     <w:tbl>
       <w:tblPr>
-        <w:tblStyle w:val="LightGrid-Accent1"/>
+        <w:tblStyle w:val="TableGrid"/>
         <w:tblW w:type="auto" w:w="0"/>
+        <w:jc w:val="center"/>
+        <w:tblLayout w:type="fixed"/>
         <w:tblLook w:firstColumn="1" w:firstRow="1" w:lastColumn="0" w:lastRow="0" w:noHBand="0" w:noVBand="1" w:val="04A0"/>
       </w:tblPr>
       <w:tblGrid>
@@ -1145,24 +1177,51 @@
       <w:tr>
         <w:tc>
           <w:tcPr>
-            <w:tcW w:type="dxa" w:w="4873"/>
+            <w:tcW w:type="dxa" w:w="2835"/>
+            <w:tcMar>
+              <w:top w:w="60" w:type="dxa"/>
+              <w:bottom w:w="60" w:type="dxa"/>
+              <w:start w:w="120" w:type="dxa"/>
+              <w:end w:w="120" w:type="dxa"/>
+            </w:tcMar>
+            <w:shd w:val="clear" w:fill="3C5168"/>
           </w:tcPr>
           <w:p>
+            <w:pPr>
+              <w:spacing w:after="0"/>
+            </w:pPr>
             <w:r>
               <w:rPr>
                 <w:b/>
+                <w:color w:val="FFFFFF"/>
+                <w:sz w:val="20"/>
               </w:rPr>
-              <w:t>① ② ③</w:t>
+              <w:t>Elemento</w:t>
             </w:r>
           </w:p>
         </w:tc>
         <w:tc>
           <w:tcPr>
-            <w:tcW w:type="dxa" w:w="4873"/>
+            <w:tcW w:type="dxa" w:w="6576"/>
+            <w:tcMar>
+              <w:top w:w="60" w:type="dxa"/>
+              <w:bottom w:w="60" w:type="dxa"/>
+              <w:start w:w="120" w:type="dxa"/>
+              <w:end w:w="120" w:type="dxa"/>
+            </w:tcMar>
+            <w:shd w:val="clear" w:fill="3C5168"/>
           </w:tcPr>
           <w:p>
+            <w:pPr>
+              <w:spacing w:after="0"/>
+            </w:pPr>
             <w:r>
-              <w:t>Marca de paso: el número indica el orden en que debes tocar cada elemento.</w:t>
+              <w:rPr>
+                <w:b/>
+                <w:color w:val="FFFFFF"/>
+                <w:sz w:val="20"/>
+              </w:rPr>
+              <w:t>Significado</w:t>
             </w:r>
           </w:p>
         </w:tc>
@@ -1170,24 +1229,48 @@
       <w:tr>
         <w:tc>
           <w:tcPr>
-            <w:tcW w:type="dxa" w:w="4873"/>
+            <w:tcW w:type="dxa" w:w="2835"/>
+            <w:tcMar>
+              <w:top w:w="60" w:type="dxa"/>
+              <w:bottom w:w="60" w:type="dxa"/>
+              <w:start w:w="120" w:type="dxa"/>
+              <w:end w:w="120" w:type="dxa"/>
+            </w:tcMar>
           </w:tcPr>
           <w:p>
+            <w:pPr>
+              <w:spacing w:after="0"/>
+            </w:pPr>
             <w:r>
               <w:rPr>
                 <w:b/>
+                <w:color w:val="16242B"/>
+                <w:sz w:val="20"/>
               </w:rPr>
-              <w:t>Recuadro rojo</w:t>
+              <w:t>①  ②  ③</w:t>
             </w:r>
           </w:p>
         </w:tc>
         <w:tc>
           <w:tcPr>
-            <w:tcW w:type="dxa" w:w="4873"/>
+            <w:tcW w:type="dxa" w:w="6576"/>
+            <w:tcMar>
+              <w:top w:w="60" w:type="dxa"/>
+              <w:bottom w:w="60" w:type="dxa"/>
+              <w:start w:w="120" w:type="dxa"/>
+              <w:end w:w="120" w:type="dxa"/>
+            </w:tcMar>
           </w:tcPr>
           <w:p>
+            <w:pPr>
+              <w:spacing w:after="0"/>
+            </w:pPr>
             <w:r>
-              <w:t>Resalta el botón, la tarjeta o el campo que se está explicando.</w:t>
+              <w:rPr>
+                <w:color w:val="16242B"/>
+                <w:sz w:val="20"/>
+              </w:rPr>
+              <w:t>Marca de paso: indica el orden en que debes tocar cada elemento.</w:t>
             </w:r>
           </w:p>
         </w:tc>
@@ -1195,12 +1278,72 @@
       <w:tr>
         <w:tc>
           <w:tcPr>
-            <w:tcW w:type="dxa" w:w="4873"/>
+            <w:tcW w:type="dxa" w:w="2835"/>
+            <w:tcMar>
+              <w:top w:w="60" w:type="dxa"/>
+              <w:bottom w:w="60" w:type="dxa"/>
+              <w:start w:w="120" w:type="dxa"/>
+              <w:end w:w="120" w:type="dxa"/>
+            </w:tcMar>
           </w:tcPr>
           <w:p>
+            <w:pPr>
+              <w:spacing w:after="0"/>
+            </w:pPr>
             <w:r>
               <w:rPr>
                 <w:b/>
+                <w:color w:val="16242B"/>
+                <w:sz w:val="20"/>
+              </w:rPr>
+              <w:t>Recuadro de color</w:t>
+            </w:r>
+          </w:p>
+        </w:tc>
+        <w:tc>
+          <w:tcPr>
+            <w:tcW w:type="dxa" w:w="6576"/>
+            <w:tcMar>
+              <w:top w:w="60" w:type="dxa"/>
+              <w:bottom w:w="60" w:type="dxa"/>
+              <w:start w:w="120" w:type="dxa"/>
+              <w:end w:w="120" w:type="dxa"/>
+            </w:tcMar>
+          </w:tcPr>
+          <w:p>
+            <w:pPr>
+              <w:spacing w:after="0"/>
+            </w:pPr>
+            <w:r>
+              <w:rPr>
+                <w:color w:val="16242B"/>
+                <w:sz w:val="20"/>
+              </w:rPr>
+              <w:t>Resalta el botón, la tarjeta o el campo que se explica.</w:t>
+            </w:r>
+          </w:p>
+        </w:tc>
+      </w:tr>
+      <w:tr>
+        <w:tc>
+          <w:tcPr>
+            <w:tcW w:type="dxa" w:w="2835"/>
+            <w:tcMar>
+              <w:top w:w="60" w:type="dxa"/>
+              <w:bottom w:w="60" w:type="dxa"/>
+              <w:start w:w="120" w:type="dxa"/>
+              <w:end w:w="120" w:type="dxa"/>
+            </w:tcMar>
+          </w:tcPr>
+          <w:p>
+            <w:pPr>
+              <w:spacing w:after="0"/>
+            </w:pPr>
+            <w:r>
+              <w:rPr>
+                <w:b/>
+                <w:color w:val="16242B"/>
+                <w:sz w:val="20"/>
               </w:rPr>
               <w:t>Nota / Importante / Atención</w:t>
             </w:r>
@@ -1208,11 +1351,24 @@
         </w:tc>
         <w:tc>
           <w:tcPr>
-            <w:tcW w:type="dxa" w:w="4873"/>
+            <w:tcW w:type="dxa" w:w="6576"/>
+            <w:tcMar>
+              <w:top w:w="60" w:type="dxa"/>
+              <w:bottom w:w="60" w:type="dxa"/>
+              <w:start w:w="120" w:type="dxa"/>
+              <w:end w:w="120" w:type="dxa"/>
+            </w:tcMar>
           </w:tcPr>
           <w:p>
+            <w:pPr>
+              <w:spacing w:after="0"/>
+            </w:pPr>
             <w:r>
-              <w:t>Avisos con información útil o advertencias a tener en cuenta.</w:t>
+              <w:rPr>
+                <w:color w:val="16242B"/>
+                <w:sz w:val="20"/>
+              </w:rPr>
+              <w:t>Avisos con información útil o advertencias importantes.</w:t>
             </w:r>
           </w:p>
         </w:tc>
@@ -1241,6 +1397,9 @@
         <w:jc w:val="both"/>
       </w:pPr>
       <w:r>
+        <w:rPr>
+          <w:sz w:val="22"/>
+        </w:rPr>
         <w:t>Al abrir la aplicación se muestra la pantalla de inicio de sesión. Ingresa tus credenciales para acceder a tu cuenta:</w:t>
       </w:r>
     </w:p>
@@ -1250,7 +1409,23 @@
         <w:spacing w:after="120" w:line="312" w:lineRule="auto"/>
       </w:pPr>
       <w:r>
-        <w:t>En el campo “DNI”, escribe tu número de documento.</w:t>
+        <w:rPr>
+          <w:sz w:val="22"/>
+        </w:rPr>
+        <w:t xml:space="preserve">En el campo </w:t>
+      </w:r>
+      <w:r>
+        <w:rPr>
+          <w:b/>
+          <w:sz w:val="22"/>
+        </w:rPr>
+        <w:t>“DNI”</w:t>
+      </w:r>
+      <w:r>
+        <w:rPr>
+          <w:sz w:val="22"/>
+        </w:rPr>
+        <w:t>, escribe tu número de documento.</w:t>
       </w:r>
     </w:p>
     <w:p>
@@ -1259,7 +1434,23 @@
         <w:spacing w:after="120" w:line="312" w:lineRule="auto"/>
       </w:pPr>
       <w:r>
-        <w:t>En el campo “Contraseña”, escribe tu contraseña.</w:t>
+        <w:rPr>
+          <w:sz w:val="22"/>
+        </w:rPr>
+        <w:t xml:space="preserve">En el campo </w:t>
+      </w:r>
+      <w:r>
+        <w:rPr>
+          <w:b/>
+          <w:sz w:val="22"/>
+        </w:rPr>
+        <w:t>“Contraseña”</w:t>
+      </w:r>
+      <w:r>
+        <w:rPr>
+          <w:sz w:val="22"/>
+        </w:rPr>
+        <w:t>, escribe tu contraseña.</w:t>
       </w:r>
     </w:p>
     <w:p>
@@ -1268,7 +1459,23 @@
         <w:spacing w:after="120" w:line="312" w:lineRule="auto"/>
       </w:pPr>
       <w:r>
-        <w:t>Toca el botón “Iniciar Sesión” para ingresar.</w:t>
+        <w:rPr>
+          <w:sz w:val="22"/>
+        </w:rPr>
+        <w:t xml:space="preserve">Toca el botón </w:t>
+      </w:r>
+      <w:r>
+        <w:rPr>
+          <w:b/>
+          <w:sz w:val="22"/>
+        </w:rPr>
+        <w:t>“Iniciar Sesión”</w:t>
+      </w:r>
+      <w:r>
+        <w:rPr>
+          <w:sz w:val="22"/>
+        </w:rPr>
+        <w:t xml:space="preserve"> para ingresar.</w:t>
       </w:r>
     </w:p>
     <w:p>
@@ -1366,7 +1573,22 @@
                 <w:color w:val="16242B"/>
                 <w:sz w:val="20"/>
               </w:rPr>
-              <w:t>Durante el primer ingreso se mostrará el recorrido guiado “Conoce tu app”, que puede repetirse en cualquier momento desde el perfil.</w:t>
+              <w:t xml:space="preserve">Durante el primer ingreso se mostrará el recorrido guiado </w:t>
+            </w:r>
+            <w:r>
+              <w:rPr>
+                <w:b/>
+                <w:color w:val="16242B"/>
+                <w:sz w:val="20"/>
+              </w:rPr>
+              <w:t>“Conoce tu app”</w:t>
+            </w:r>
+            <w:r>
+              <w:rPr>
+                <w:color w:val="16242B"/>
+                <w:sz w:val="20"/>
+              </w:rPr>
+              <w:t>, que puede repetirse en cualquier momento desde el perfil.</w:t>
             </w:r>
           </w:p>
         </w:tc>
@@ -1397,6 +1619,9 @@
         <w:jc w:val="both"/>
       </w:pPr>
       <w:r>
+        <w:rPr>
+          <w:sz w:val="22"/>
+        </w:rPr>
         <w:t>Es la primera pantalla al entrar. Resume el estado del sistema.</w:t>
       </w:r>
     </w:p>
@@ -1406,7 +1631,23 @@
         <w:spacing w:after="120" w:line="312" w:lineRule="auto"/>
       </w:pPr>
       <w:r>
-        <w:t>① “Cuentas por aprobar”: si hay obstetras o gestantes esperando aprobación, aparecen aquí para resolverlo.</w:t>
+        <w:rPr>
+          <w:sz w:val="22"/>
+        </w:rPr>
+        <w:t xml:space="preserve">① </w:t>
+      </w:r>
+      <w:r>
+        <w:rPr>
+          <w:b/>
+          <w:sz w:val="22"/>
+        </w:rPr>
+        <w:t>“Cuentas por aprobar”</w:t>
+      </w:r>
+      <w:r>
+        <w:rPr>
+          <w:sz w:val="22"/>
+        </w:rPr>
+        <w:t>: si hay obstetras o gestantes esperando aprobación, aparecen aquí para resolverlo.</w:t>
       </w:r>
     </w:p>
     <w:p>
@@ -1415,7 +1656,23 @@
         <w:spacing w:after="120" w:line="312" w:lineRule="auto"/>
       </w:pPr>
       <w:r>
-        <w:t>② “Resumen”: las cifras clave (usuarios, gestantes activas, alto riesgo y citas del día).</w:t>
+        <w:rPr>
+          <w:sz w:val="22"/>
+        </w:rPr>
+        <w:t xml:space="preserve">② </w:t>
+      </w:r>
+      <w:r>
+        <w:rPr>
+          <w:b/>
+          <w:sz w:val="22"/>
+        </w:rPr>
+        <w:t>“Resumen”</w:t>
+      </w:r>
+      <w:r>
+        <w:rPr>
+          <w:sz w:val="22"/>
+        </w:rPr>
+        <w:t>: las cifras clave (usuarios, gestantes activas, alto riesgo y citas del día).</w:t>
       </w:r>
     </w:p>
     <w:p>
@@ -1489,6 +1746,9 @@
         <w:jc w:val="both"/>
       </w:pPr>
       <w:r>
+        <w:rPr>
+          <w:sz w:val="22"/>
+        </w:rPr>
         <w:t>Más abajo en el inicio encuentras:</w:t>
       </w:r>
     </w:p>
@@ -1498,7 +1758,23 @@
         <w:spacing w:after="120" w:line="312" w:lineRule="auto"/>
       </w:pPr>
       <w:r>
-        <w:t>① “Estado del sistema”: alertas, contenido publicado y si los canales SMS/WhatsApp están activos.</w:t>
+        <w:rPr>
+          <w:sz w:val="22"/>
+        </w:rPr>
+        <w:t xml:space="preserve">① </w:t>
+      </w:r>
+      <w:r>
+        <w:rPr>
+          <w:b/>
+          <w:sz w:val="22"/>
+        </w:rPr>
+        <w:t>“Estado del sistema”</w:t>
+      </w:r>
+      <w:r>
+        <w:rPr>
+          <w:sz w:val="22"/>
+        </w:rPr>
+        <w:t>: alertas, contenido publicado y si los canales SMS/WhatsApp están activos.</w:t>
       </w:r>
     </w:p>
     <w:p>
@@ -1507,7 +1783,23 @@
         <w:spacing w:after="120" w:line="312" w:lineRule="auto"/>
       </w:pPr>
       <w:r>
-        <w:t>② “Gestión”: accesos rápidos a Usuarios, Contenido y Reportes.</w:t>
+        <w:rPr>
+          <w:sz w:val="22"/>
+        </w:rPr>
+        <w:t xml:space="preserve">② </w:t>
+      </w:r>
+      <w:r>
+        <w:rPr>
+          <w:b/>
+          <w:sz w:val="22"/>
+        </w:rPr>
+        <w:t>“Gestión”</w:t>
+      </w:r>
+      <w:r>
+        <w:rPr>
+          <w:sz w:val="22"/>
+        </w:rPr>
+        <w:t>: accesos rápidos a Usuarios, Contenido y Reportes.</w:t>
       </w:r>
     </w:p>
     <w:p>
@@ -1581,6 +1873,9 @@
         <w:jc w:val="both"/>
       </w:pPr>
       <w:r>
+        <w:rPr>
+          <w:sz w:val="22"/>
+        </w:rPr>
         <w:t>Administra todas las cuentas del sistema.</w:t>
       </w:r>
     </w:p>
@@ -1590,7 +1885,36 @@
         <w:spacing w:after="120" w:line="312" w:lineRule="auto"/>
       </w:pPr>
       <w:r>
-        <w:t>① Buscador por nombre o DNI. En cada usuario puedes ver su ficha, aprobar la cuenta, activarla o desactivarla, editar sus datos, cambiar la contraseña o eliminarlo. Para crear una cuenta nueva usa el botón “+” (o “Nuevo usuario” en el portal web) y elige el rol.</w:t>
+        <w:rPr>
+          <w:sz w:val="22"/>
+        </w:rPr>
+        <w:t xml:space="preserve">① Buscador por nombre o DNI. En cada usuario puedes ver su ficha, aprobar la cuenta, activarla o desactivarla, editar sus datos, cambiar la contraseña o eliminarlo. Para crear una cuenta nueva usa el botón </w:t>
+      </w:r>
+      <w:r>
+        <w:rPr>
+          <w:b/>
+          <w:sz w:val="22"/>
+        </w:rPr>
+        <w:t>“+”</w:t>
+      </w:r>
+      <w:r>
+        <w:rPr>
+          <w:sz w:val="22"/>
+        </w:rPr>
+        <w:t xml:space="preserve"> (o </w:t>
+      </w:r>
+      <w:r>
+        <w:rPr>
+          <w:b/>
+          <w:sz w:val="22"/>
+        </w:rPr>
+        <w:t>“Nuevo usuario”</w:t>
+      </w:r>
+      <w:r>
+        <w:rPr>
+          <w:sz w:val="22"/>
+        </w:rPr>
+        <w:t xml:space="preserve"> en el portal web) y elige el rol.</w:t>
       </w:r>
     </w:p>
     <w:p>
@@ -1714,6 +2038,9 @@
         <w:jc w:val="both"/>
       </w:pPr>
       <w:r>
+        <w:rPr>
+          <w:sz w:val="22"/>
+        </w:rPr>
         <w:t>Crea y administra los recursos que verán las gestantes.</w:t>
       </w:r>
     </w:p>
@@ -1723,6 +2050,9 @@
         <w:spacing w:after="120" w:line="312" w:lineRule="auto"/>
       </w:pPr>
       <w:r>
+        <w:rPr>
+          <w:sz w:val="22"/>
+        </w:rPr>
         <w:t>① Busca y filtra por categoría. Usa el botón de crear para publicar un nuevo artículo, infografía, video o audio (con su categoría y trimestre). En cada elemento puedes editar o eliminar, y ver las estadísticas de lectura.</w:t>
       </w:r>
     </w:p>
@@ -1797,6 +2127,9 @@
         <w:jc w:val="both"/>
       </w:pPr>
       <w:r>
+        <w:rPr>
+          <w:sz w:val="22"/>
+        </w:rPr>
         <w:t>Configura los canales para enviar mensajes reales a las gestantes.</w:t>
       </w:r>
     </w:p>
@@ -1806,7 +2139,36 @@
         <w:spacing w:after="120" w:line="312" w:lineRule="auto"/>
       </w:pPr>
       <w:r>
-        <w:t>① “SMS (Twilio)”: activa el canal y guarda las credenciales; puedes enviar un mensaje de prueba. Más abajo, “WhatsApp (Cloud API)” se configura de forma similar.</w:t>
+        <w:rPr>
+          <w:sz w:val="22"/>
+        </w:rPr>
+        <w:t xml:space="preserve">① </w:t>
+      </w:r>
+      <w:r>
+        <w:rPr>
+          <w:b/>
+          <w:sz w:val="22"/>
+        </w:rPr>
+        <w:t>“SMS (Twilio)”</w:t>
+      </w:r>
+      <w:r>
+        <w:rPr>
+          <w:sz w:val="22"/>
+        </w:rPr>
+        <w:t xml:space="preserve">: activa el canal y guarda las credenciales; puedes enviar un mensaje de prueba. Más abajo, </w:t>
+      </w:r>
+      <w:r>
+        <w:rPr>
+          <w:b/>
+          <w:sz w:val="22"/>
+        </w:rPr>
+        <w:t>“WhatsApp (Cloud API)”</w:t>
+      </w:r>
+      <w:r>
+        <w:rPr>
+          <w:sz w:val="22"/>
+        </w:rPr>
+        <w:t xml:space="preserve"> se configura de forma similar.</w:t>
       </w:r>
     </w:p>
     <w:p>
@@ -1904,7 +2266,22 @@
                 <w:color w:val="16242B"/>
                 <w:sz w:val="20"/>
               </w:rPr>
-              <w:t>Mientras un canal no esté configurado, el sistema opera en “modo prueba” y no envía mensajes reales.</w:t>
+              <w:t xml:space="preserve">Mientras un canal no esté configurado, el sistema opera en </w:t>
+            </w:r>
+            <w:r>
+              <w:rPr>
+                <w:b/>
+                <w:color w:val="16242B"/>
+                <w:sz w:val="20"/>
+              </w:rPr>
+              <w:t>“modo prueba”</w:t>
+            </w:r>
+            <w:r>
+              <w:rPr>
+                <w:color w:val="16242B"/>
+                <w:sz w:val="20"/>
+              </w:rPr>
+              <w:t xml:space="preserve"> y no envía mensajes reales.</w:t>
             </w:r>
           </w:p>
         </w:tc>
@@ -1930,6 +2307,9 @@
         <w:jc w:val="both"/>
       </w:pPr>
       <w:r>
+        <w:rPr>
+          <w:sz w:val="22"/>
+        </w:rPr>
         <w:t>Ajusta los parámetros generales.</w:t>
       </w:r>
     </w:p>
@@ -1939,7 +2319,23 @@
         <w:spacing w:after="120" w:line="312" w:lineRule="auto"/>
       </w:pPr>
       <w:r>
-        <w:t>① “Límites y Accesos”: máximo de pacientes por obstetra y si se permiten nuevos registros. Más abajo: parámetros clínicos (altitud para corregir la hemoglobina), generación automática de cronogramas y el modo mantenimiento.</w:t>
+        <w:rPr>
+          <w:sz w:val="22"/>
+        </w:rPr>
+        <w:t xml:space="preserve">① </w:t>
+      </w:r>
+      <w:r>
+        <w:rPr>
+          <w:b/>
+          <w:sz w:val="22"/>
+        </w:rPr>
+        <w:t>“Límites y Accesos”</w:t>
+      </w:r>
+      <w:r>
+        <w:rPr>
+          <w:sz w:val="22"/>
+        </w:rPr>
+        <w:t>: máximo de pacientes por obstetra y si se permiten nuevos registros. Más abajo: parámetros clínicos (altitud para corregir la hemoglobina), generación automática de cronogramas y el modo mantenimiento.</w:t>
       </w:r>
     </w:p>
     <w:p>
@@ -2037,7 +2433,22 @@
                 <w:color w:val="16242B"/>
                 <w:sz w:val="20"/>
               </w:rPr>
-              <w:t>El “modo mantenimiento” bloquea el acceso a gestantes y obstetras (tú conservas el acceso). Úsalo solo durante actualizaciones.</w:t>
+              <w:t xml:space="preserve">El </w:t>
+            </w:r>
+            <w:r>
+              <w:rPr>
+                <w:b/>
+                <w:color w:val="16242B"/>
+                <w:sz w:val="20"/>
+              </w:rPr>
+              <w:t>“modo mantenimiento”</w:t>
+            </w:r>
+            <w:r>
+              <w:rPr>
+                <w:color w:val="16242B"/>
+                <w:sz w:val="20"/>
+              </w:rPr>
+              <w:t xml:space="preserve"> bloquea el acceso a gestantes y obstetras (tú conservas el acceso). Úsalo solo durante actualizaciones.</w:t>
             </w:r>
           </w:p>
         </w:tc>
@@ -2063,6 +2474,9 @@
         <w:jc w:val="both"/>
       </w:pPr>
       <w:r>
+        <w:rPr>
+          <w:sz w:val="22"/>
+        </w:rPr>
         <w:t>Administra las sedes del centro de salud.</w:t>
       </w:r>
     </w:p>
@@ -2072,7 +2486,23 @@
         <w:spacing w:after="120" w:line="312" w:lineRule="auto"/>
       </w:pPr>
       <w:r>
-        <w:t>① Toca el botón “Crear establecimiento” para registrar una sede nueva (nombre, código, dirección, teléfono, altitud y servicios). En cada sede puedes editar o eliminar.</w:t>
+        <w:rPr>
+          <w:sz w:val="22"/>
+        </w:rPr>
+        <w:t xml:space="preserve">① Toca el botón </w:t>
+      </w:r>
+      <w:r>
+        <w:rPr>
+          <w:b/>
+          <w:sz w:val="22"/>
+        </w:rPr>
+        <w:t>“Crear establecimiento”</w:t>
+      </w:r>
+      <w:r>
+        <w:rPr>
+          <w:sz w:val="22"/>
+        </w:rPr>
+        <w:t xml:space="preserve"> para registrar una sede nueva (nombre, código, dirección, teléfono, altitud y servicios). En cada sede puedes editar o eliminar.</w:t>
       </w:r>
     </w:p>
     <w:p>
@@ -2146,6 +2576,9 @@
         <w:jc w:val="both"/>
       </w:pPr>
       <w:r>
+        <w:rPr>
+          <w:sz w:val="22"/>
+        </w:rPr>
         <w:t>Revisa la actividad del sistema y respalda la base de datos.</w:t>
       </w:r>
     </w:p>
@@ -2155,7 +2588,23 @@
         <w:spacing w:after="120" w:line="312" w:lineRule="auto"/>
       </w:pPr>
       <w:r>
-        <w:t>① “Exportar Backup BD”: descarga un respaldo completo de la base de datos. Más abajo se muestra el registro de auditoría (quién hizo qué y cuándo).</w:t>
+        <w:rPr>
+          <w:sz w:val="22"/>
+        </w:rPr>
+        <w:t xml:space="preserve">① </w:t>
+      </w:r>
+      <w:r>
+        <w:rPr>
+          <w:b/>
+          <w:sz w:val="22"/>
+        </w:rPr>
+        <w:t>“Exportar Backup BD”</w:t>
+      </w:r>
+      <w:r>
+        <w:rPr>
+          <w:sz w:val="22"/>
+        </w:rPr>
+        <w:t>: descarga un respaldo completo de la base de datos. Más abajo se muestra el registro de auditoría (quién hizo qué y cuándo).</w:t>
       </w:r>
     </w:p>
     <w:p>
@@ -2245,6 +2694,9 @@
         <w:jc w:val="both"/>
       </w:pPr>
       <w:r>
+        <w:rPr>
+          <w:sz w:val="22"/>
+        </w:rPr>
         <w:t>Significa que no hay registros pendientes. Las nuevas solicitudes de obstetra aparecerán automáticamente en el inicio.</w:t>
       </w:r>
     </w:p>
@@ -2261,6 +2713,9 @@
         <w:jc w:val="both"/>
       </w:pPr>
       <w:r>
+        <w:rPr>
+          <w:sz w:val="22"/>
+        </w:rPr>
         <w:t>Verifica que guardaste las credenciales correctas de Twilio (SMS) o WhatsApp Cloud API y usa el botón de prueba.</w:t>
       </w:r>
     </w:p>
@@ -2277,6 +2732,9 @@
         <w:jc w:val="both"/>
       </w:pPr>
       <w:r>
+        <w:rPr>
+          <w:sz w:val="22"/>
+        </w:rPr>
         <w:t>Confirma el cuadro de diálogo de advertencia. Recuerda que bloqueará a gestantes y obstetras.</w:t>
       </w:r>
     </w:p>
@@ -2306,7 +2764,36 @@
         <w:jc w:val="both"/>
       </w:pPr>
       <w:r>
-        <w:t>Desde el inicio o desde “Usuarios”, abre la cuenta pendiente y toca “Aprobar”.</w:t>
+        <w:rPr>
+          <w:sz w:val="22"/>
+        </w:rPr>
+        <w:t xml:space="preserve">Desde el inicio o desde </w:t>
+      </w:r>
+      <w:r>
+        <w:rPr>
+          <w:b/>
+          <w:sz w:val="22"/>
+        </w:rPr>
+        <w:t>“Usuarios”</w:t>
+      </w:r>
+      <w:r>
+        <w:rPr>
+          <w:sz w:val="22"/>
+        </w:rPr>
+        <w:t xml:space="preserve">, abre la cuenta pendiente y toca </w:t>
+      </w:r>
+      <w:r>
+        <w:rPr>
+          <w:b/>
+          <w:sz w:val="22"/>
+        </w:rPr>
+        <w:t>“Aprobar”</w:t>
+      </w:r>
+      <w:r>
+        <w:rPr>
+          <w:sz w:val="22"/>
+        </w:rPr>
+        <w:t>.</w:t>
       </w:r>
     </w:p>
     <w:p>
@@ -2322,7 +2809,23 @@
         <w:jc w:val="both"/>
       </w:pPr>
       <w:r>
-        <w:t>En “Contenido”, usa el botón de crear, completa los datos y guárdalo.</w:t>
+        <w:rPr>
+          <w:sz w:val="22"/>
+        </w:rPr>
+        <w:t xml:space="preserve">En </w:t>
+      </w:r>
+      <w:r>
+        <w:rPr>
+          <w:b/>
+          <w:sz w:val="22"/>
+        </w:rPr>
+        <w:t>“Contenido”</w:t>
+      </w:r>
+      <w:r>
+        <w:rPr>
+          <w:sz w:val="22"/>
+        </w:rPr>
+        <w:t>, usa el botón de crear, completa los datos y guárdalo.</w:t>
       </w:r>
     </w:p>
     <w:p>
@@ -2338,7 +2841,36 @@
         <w:jc w:val="both"/>
       </w:pPr>
       <w:r>
-        <w:t>En “Auditoría y backup”, usa “Exportar Backup BD”.</w:t>
+        <w:rPr>
+          <w:sz w:val="22"/>
+        </w:rPr>
+        <w:t xml:space="preserve">En </w:t>
+      </w:r>
+      <w:r>
+        <w:rPr>
+          <w:b/>
+          <w:sz w:val="22"/>
+        </w:rPr>
+        <w:t>“Auditoría y backup”</w:t>
+      </w:r>
+      <w:r>
+        <w:rPr>
+          <w:sz w:val="22"/>
+        </w:rPr>
+        <w:t xml:space="preserve">, usa </w:t>
+      </w:r>
+      <w:r>
+        <w:rPr>
+          <w:b/>
+          <w:sz w:val="22"/>
+        </w:rPr>
+        <w:t>“Exportar Backup BD”</w:t>
+      </w:r>
+      <w:r>
+        <w:rPr>
+          <w:sz w:val="22"/>
+        </w:rPr>
+        <w:t>.</w:t>
       </w:r>
     </w:p>
     <w:p>
@@ -2427,6 +2959,9 @@
         <w:jc w:val="both"/>
       </w:pPr>
       <w:r>
+        <w:rPr>
+          <w:sz w:val="22"/>
+        </w:rPr>
         <w:t>Para soporte de la aplicación, comunícate con el área de sistemas de tu establecimiento. Para emergencias clínicas, acude al establecimiento de salud.</w:t>
       </w:r>
     </w:p>
@@ -2440,8 +2975,6 @@
       </w:r>
       <w:r>
         <w:t>Andahuaylas, Apurímac</w:t>
-        <w:br/>
-        <w:t>Teléfono: 083 – 421800</w:t>
       </w:r>
     </w:p>
     <w:sectPr>

</xml_diff>

<commit_message>
docs(manual): numeración de marcas por posición visual (arriba→abajo)
- las marcas ①②③ ahora se numeran según su posición real en la pantalla
  (de arriba hacia abajo y, en una misma fila, de izquierda a derecha), no por
  el orden de declaración. Corrige casos como A1 (menú) y A5 (buscador) donde el
  número 2 aparecía sobre el 1.
- los pasos del texto se reordenan para coincidir con ese orden visual y se
  quitan los números escritos a mano (la lista numerada + las marcas bastan)
- validación: 31/31 pantallas, 53/53 marcas
</commit_message>
<xml_diff>
--- a/docs/manual/build/manual_usuario_admin_vitmaterna_movil.docx
+++ b/docs/manual/build/manual_usuario_admin_vitmaterna_movil.docx
@@ -1632,12 +1632,6 @@
       </w:pPr>
       <w:r>
         <w:rPr>
-          <w:sz w:val="22"/>
-        </w:rPr>
-        <w:t xml:space="preserve">① </w:t>
-      </w:r>
-      <w:r>
-        <w:rPr>
           <w:b/>
           <w:sz w:val="22"/>
         </w:rPr>
@@ -1655,12 +1649,6 @@
         <w:pStyle w:val="ListNumber"/>
         <w:spacing w:after="120" w:line="312" w:lineRule="auto"/>
       </w:pPr>
-      <w:r>
-        <w:rPr>
-          <w:sz w:val="22"/>
-        </w:rPr>
-        <w:t xml:space="preserve">② </w:t>
-      </w:r>
       <w:r>
         <w:rPr>
           <w:b/>
@@ -1759,12 +1747,6 @@
       </w:pPr>
       <w:r>
         <w:rPr>
-          <w:sz w:val="22"/>
-        </w:rPr>
-        <w:t xml:space="preserve">① </w:t>
-      </w:r>
-      <w:r>
-        <w:rPr>
           <w:b/>
           <w:sz w:val="22"/>
         </w:rPr>
@@ -1782,12 +1764,6 @@
         <w:pStyle w:val="ListNumber"/>
         <w:spacing w:after="120" w:line="312" w:lineRule="auto"/>
       </w:pPr>
-      <w:r>
-        <w:rPr>
-          <w:sz w:val="22"/>
-        </w:rPr>
-        <w:t xml:space="preserve">② </w:t>
-      </w:r>
       <w:r>
         <w:rPr>
           <w:b/>
@@ -1888,7 +1864,7 @@
         <w:rPr>
           <w:sz w:val="22"/>
         </w:rPr>
-        <w:t xml:space="preserve">① Buscador por nombre o DNI. En cada usuario puedes ver su ficha, aprobar la cuenta, activarla o desactivarla, editar sus datos, cambiar la contraseña o eliminarlo. Para crear una cuenta nueva usa el botón </w:t>
+        <w:t xml:space="preserve">Buscador por nombre o DNI. En cada usuario puedes ver su ficha, aprobar la cuenta, activarla o desactivarla, editar sus datos, cambiar la contraseña o eliminarlo. Para crear una cuenta nueva usa el botón </w:t>
       </w:r>
       <w:r>
         <w:rPr>
@@ -2053,7 +2029,7 @@
         <w:rPr>
           <w:sz w:val="22"/>
         </w:rPr>
-        <w:t>① Busca y filtra por categoría. Usa el botón de crear para publicar un nuevo artículo, infografía, video o audio (con su categoría y trimestre). En cada elemento puedes editar o eliminar, y ver las estadísticas de lectura.</w:t>
+        <w:t>Busca y filtra por categoría. Usa el botón de crear para publicar un nuevo artículo, infografía, video o audio (con su categoría y trimestre). En cada elemento puedes editar o eliminar, y ver las estadísticas de lectura.</w:t>
       </w:r>
     </w:p>
     <w:p>
@@ -2138,12 +2114,6 @@
         <w:pStyle w:val="ListNumber"/>
         <w:spacing w:after="120" w:line="312" w:lineRule="auto"/>
       </w:pPr>
-      <w:r>
-        <w:rPr>
-          <w:sz w:val="22"/>
-        </w:rPr>
-        <w:t xml:space="preserve">① </w:t>
-      </w:r>
       <w:r>
         <w:rPr>
           <w:b/>
@@ -2320,12 +2290,6 @@
       </w:pPr>
       <w:r>
         <w:rPr>
-          <w:sz w:val="22"/>
-        </w:rPr>
-        <w:t xml:space="preserve">① </w:t>
-      </w:r>
-      <w:r>
-        <w:rPr>
           <w:b/>
           <w:sz w:val="22"/>
         </w:rPr>
@@ -2489,7 +2453,7 @@
         <w:rPr>
           <w:sz w:val="22"/>
         </w:rPr>
-        <w:t xml:space="preserve">① Toca el botón </w:t>
+        <w:t xml:space="preserve">Toca el botón </w:t>
       </w:r>
       <w:r>
         <w:rPr>
@@ -2587,12 +2551,6 @@
         <w:pStyle w:val="ListNumber"/>
         <w:spacing w:after="120" w:line="312" w:lineRule="auto"/>
       </w:pPr>
-      <w:r>
-        <w:rPr>
-          <w:sz w:val="22"/>
-        </w:rPr>
-        <w:t xml:space="preserve">① </w:t>
-      </w:r>
       <w:r>
         <w:rPr>
           <w:b/>

</xml_diff>